<commit_message>
Partie 1 : Anatomie d'un prompt
</commit_message>
<xml_diff>
--- a/ai-business_assistant/Atelier Prompt Engineering.docx
+++ b/ai-business_assistant/Atelier Prompt Engineering.docx
@@ -201,7 +201,638 @@
         <w:t xml:space="preserve">  Anatomie d'un prompt</w:t>
       </w:r>
     </w:p>
-    <w:p/>
+    <w:p>
+      <w:pPr>
+        <w:rPr>
+          <w:sz w:val="28"/>
+          <w:szCs w:val="28"/>
+        </w:rPr>
+      </w:pPr>
+      <w:r>
+        <w:rPr>
+          <w:sz w:val="28"/>
+          <w:szCs w:val="28"/>
+        </w:rPr>
+        <w:t xml:space="preserve">Question : </w:t>
+      </w:r>
+      <w:r>
+        <w:rPr>
+          <w:sz w:val="28"/>
+          <w:szCs w:val="28"/>
+        </w:rPr>
+        <w:t>Construire un prompt, à partir de ses différentes composantes, pour résoudre un problème comme</w:t>
+      </w:r>
+      <w:r>
+        <w:rPr>
+          <w:sz w:val="28"/>
+          <w:szCs w:val="28"/>
+        </w:rPr>
+        <w:t xml:space="preserve"> </w:t>
+      </w:r>
+      <w:r>
+        <w:rPr>
+          <w:sz w:val="28"/>
+          <w:szCs w:val="28"/>
+        </w:rPr>
+        <w:t>« Je souhaite analyser les retours de clients d'une entreprise. »</w:t>
+      </w:r>
+    </w:p>
+    <w:p>
+      <w:pPr>
+        <w:rPr>
+          <w:sz w:val="28"/>
+          <w:szCs w:val="28"/>
+        </w:rPr>
+      </w:pPr>
+    </w:p>
+    <w:p>
+      <w:pPr>
+        <w:spacing w:after="160" w:line="288" w:lineRule="auto"/>
+        <w:rPr>
+          <w:sz w:val="28"/>
+          <w:szCs w:val="28"/>
+        </w:rPr>
+      </w:pPr>
+      <w:r>
+        <w:rPr>
+          <w:sz w:val="28"/>
+          <w:szCs w:val="28"/>
+        </w:rPr>
+        <w:t>Un bon prompt s'appuie sur plusieurs composantes qui, assemblées, réduisent l'ambiguïté et guident le modèle vers une réponse exploitable : le rôle (la posture que doit adopter le modèle), le contexte (la situation et les données disponibles), la tâche (ce qui est demandé précisément), les contraintes (limites, ce qu'il ne faut pas faire), le format de sortie (structure attendue) et, si besoin, des exemples. Pour le besoin « analyser les retours clients d'une entreprise », voici comment ces briques s'assemblent.</w:t>
+      </w:r>
+    </w:p>
+    <w:p>
+      <w:pPr>
+        <w:spacing w:after="160" w:line="288" w:lineRule="auto"/>
+        <w:rPr>
+          <w:sz w:val="28"/>
+          <w:szCs w:val="28"/>
+        </w:rPr>
+      </w:pPr>
+    </w:p>
+    <w:p>
+      <w:pPr>
+        <w:pStyle w:val="Titre2"/>
+      </w:pPr>
+      <w:r>
+        <w:t>Construction du prompt</w:t>
+      </w:r>
+    </w:p>
+    <w:p>
+      <w:pPr>
+        <w:shd w:val="clear" w:color="auto" w:fill="2E5090"/>
+        <w:spacing w:before="120"/>
+        <w:rPr>
+          <w:sz w:val="28"/>
+          <w:szCs w:val="28"/>
+        </w:rPr>
+      </w:pPr>
+      <w:r>
+        <w:rPr>
+          <w:b/>
+          <w:bCs/>
+          <w:color w:val="FFFFFF"/>
+          <w:sz w:val="28"/>
+          <w:szCs w:val="28"/>
+        </w:rPr>
+        <w:t xml:space="preserve">  PROMPT</w:t>
+      </w:r>
+    </w:p>
+    <w:p>
+      <w:pPr>
+        <w:shd w:val="clear" w:color="auto" w:fill="EDF1F8"/>
+        <w:spacing w:after="40" w:line="264" w:lineRule="auto"/>
+        <w:ind w:left="200" w:right="200"/>
+        <w:rPr>
+          <w:sz w:val="28"/>
+          <w:szCs w:val="28"/>
+        </w:rPr>
+      </w:pPr>
+      <w:r>
+        <w:rPr>
+          <w:rFonts w:ascii="Consolas" w:eastAsia="Consolas" w:hAnsi="Consolas" w:cs="Consolas"/>
+          <w:sz w:val="28"/>
+          <w:szCs w:val="28"/>
+        </w:rPr>
+        <w:t xml:space="preserve">Rôle : Tu es un analyste </w:t>
+      </w:r>
+      <w:proofErr w:type="spellStart"/>
+      <w:r>
+        <w:rPr>
+          <w:rFonts w:ascii="Consolas" w:eastAsia="Consolas" w:hAnsi="Consolas" w:cs="Consolas"/>
+          <w:sz w:val="28"/>
+          <w:szCs w:val="28"/>
+        </w:rPr>
+        <w:t>customer</w:t>
+      </w:r>
+      <w:proofErr w:type="spellEnd"/>
+      <w:r>
+        <w:rPr>
+          <w:rFonts w:ascii="Consolas" w:eastAsia="Consolas" w:hAnsi="Consolas" w:cs="Consolas"/>
+          <w:sz w:val="28"/>
+          <w:szCs w:val="28"/>
+        </w:rPr>
+        <w:t xml:space="preserve"> </w:t>
+      </w:r>
+      <w:proofErr w:type="spellStart"/>
+      <w:r>
+        <w:rPr>
+          <w:rFonts w:ascii="Consolas" w:eastAsia="Consolas" w:hAnsi="Consolas" w:cs="Consolas"/>
+          <w:sz w:val="28"/>
+          <w:szCs w:val="28"/>
+        </w:rPr>
+        <w:t>experience</w:t>
+      </w:r>
+      <w:proofErr w:type="spellEnd"/>
+      <w:r>
+        <w:rPr>
+          <w:rFonts w:ascii="Consolas" w:eastAsia="Consolas" w:hAnsi="Consolas" w:cs="Consolas"/>
+          <w:sz w:val="28"/>
+          <w:szCs w:val="28"/>
+        </w:rPr>
+        <w:t xml:space="preserve"> senior, spécialisé dans l'analyse</w:t>
+      </w:r>
+      <w:r>
+        <w:rPr>
+          <w:sz w:val="28"/>
+          <w:szCs w:val="28"/>
+        </w:rPr>
+        <w:t xml:space="preserve"> </w:t>
+      </w:r>
+      <w:r>
+        <w:rPr>
+          <w:rFonts w:ascii="Consolas" w:eastAsia="Consolas" w:hAnsi="Consolas" w:cs="Consolas"/>
+          <w:sz w:val="28"/>
+          <w:szCs w:val="28"/>
+        </w:rPr>
+        <w:t>de retours clients (avis, tickets support, réponses à enquêtes de satisfaction).</w:t>
+      </w:r>
+    </w:p>
+    <w:p>
+      <w:pPr>
+        <w:shd w:val="clear" w:color="auto" w:fill="EDF1F8"/>
+        <w:spacing w:after="40" w:line="264" w:lineRule="auto"/>
+        <w:ind w:left="200" w:right="200"/>
+        <w:rPr>
+          <w:sz w:val="28"/>
+          <w:szCs w:val="28"/>
+        </w:rPr>
+      </w:pPr>
+    </w:p>
+    <w:p>
+      <w:pPr>
+        <w:shd w:val="clear" w:color="auto" w:fill="EDF1F8"/>
+        <w:spacing w:after="40" w:line="264" w:lineRule="auto"/>
+        <w:ind w:left="200" w:right="200"/>
+        <w:rPr>
+          <w:sz w:val="28"/>
+          <w:szCs w:val="28"/>
+        </w:rPr>
+      </w:pPr>
+      <w:r>
+        <w:rPr>
+          <w:rFonts w:ascii="Consolas" w:eastAsia="Consolas" w:hAnsi="Consolas" w:cs="Consolas"/>
+          <w:sz w:val="28"/>
+          <w:szCs w:val="28"/>
+        </w:rPr>
+        <w:t>Contexte : Voici un ensemble de retours clients collectés au cours des 30 derniers</w:t>
+      </w:r>
+    </w:p>
+    <w:p>
+      <w:pPr>
+        <w:shd w:val="clear" w:color="auto" w:fill="EDF1F8"/>
+        <w:spacing w:after="40" w:line="264" w:lineRule="auto"/>
+        <w:ind w:left="200" w:right="200"/>
+        <w:rPr>
+          <w:sz w:val="28"/>
+          <w:szCs w:val="28"/>
+        </w:rPr>
+      </w:pPr>
+      <w:r>
+        <w:rPr>
+          <w:rFonts w:ascii="Consolas" w:eastAsia="Consolas" w:hAnsi="Consolas" w:cs="Consolas"/>
+          <w:sz w:val="28"/>
+          <w:szCs w:val="28"/>
+        </w:rPr>
+        <w:t>Jours</w:t>
+      </w:r>
+      <w:r>
+        <w:rPr>
+          <w:rFonts w:ascii="Consolas" w:eastAsia="Consolas" w:hAnsi="Consolas" w:cs="Consolas"/>
+          <w:sz w:val="28"/>
+          <w:szCs w:val="28"/>
+        </w:rPr>
+        <w:t xml:space="preserve"> pour [nom de l'entreprise / produit]. Ces retours proviennent de plusieurs</w:t>
+      </w:r>
+      <w:r>
+        <w:rPr>
+          <w:sz w:val="28"/>
+          <w:szCs w:val="28"/>
+        </w:rPr>
+        <w:t xml:space="preserve"> </w:t>
+      </w:r>
+      <w:r>
+        <w:rPr>
+          <w:rFonts w:ascii="Consolas" w:eastAsia="Consolas" w:hAnsi="Consolas" w:cs="Consolas"/>
+          <w:sz w:val="28"/>
+          <w:szCs w:val="28"/>
+        </w:rPr>
+        <w:t>canaux (avis en ligne, emails support, réseaux sociaux) et peuvent être rédigés</w:t>
+      </w:r>
+      <w:r>
+        <w:rPr>
+          <w:sz w:val="28"/>
+          <w:szCs w:val="28"/>
+        </w:rPr>
+        <w:t xml:space="preserve"> </w:t>
+      </w:r>
+      <w:r>
+        <w:rPr>
+          <w:rFonts w:ascii="Consolas" w:eastAsia="Consolas" w:hAnsi="Consolas" w:cs="Consolas"/>
+          <w:sz w:val="28"/>
+          <w:szCs w:val="28"/>
+        </w:rPr>
+        <w:t>en français ou en anglais.</w:t>
+      </w:r>
+    </w:p>
+    <w:p>
+      <w:pPr>
+        <w:shd w:val="clear" w:color="auto" w:fill="EDF1F8"/>
+        <w:spacing w:after="40" w:line="264" w:lineRule="auto"/>
+        <w:ind w:left="200" w:right="200"/>
+        <w:rPr>
+          <w:sz w:val="28"/>
+          <w:szCs w:val="28"/>
+        </w:rPr>
+      </w:pPr>
+    </w:p>
+    <w:p>
+      <w:pPr>
+        <w:shd w:val="clear" w:color="auto" w:fill="EDF1F8"/>
+        <w:spacing w:after="40" w:line="264" w:lineRule="auto"/>
+        <w:ind w:left="200" w:right="200"/>
+        <w:rPr>
+          <w:sz w:val="28"/>
+          <w:szCs w:val="28"/>
+        </w:rPr>
+      </w:pPr>
+      <w:r>
+        <w:rPr>
+          <w:rFonts w:ascii="Consolas" w:eastAsia="Consolas" w:hAnsi="Consolas" w:cs="Consolas"/>
+          <w:sz w:val="28"/>
+          <w:szCs w:val="28"/>
+        </w:rPr>
+        <w:lastRenderedPageBreak/>
+        <w:t>Retours clients :</w:t>
+      </w:r>
+    </w:p>
+    <w:p>
+      <w:pPr>
+        <w:shd w:val="clear" w:color="auto" w:fill="EDF1F8"/>
+        <w:spacing w:after="40" w:line="264" w:lineRule="auto"/>
+        <w:ind w:left="200" w:right="200"/>
+        <w:rPr>
+          <w:sz w:val="28"/>
+          <w:szCs w:val="28"/>
+        </w:rPr>
+      </w:pPr>
+      <w:r>
+        <w:rPr>
+          <w:rFonts w:ascii="Consolas" w:eastAsia="Consolas" w:hAnsi="Consolas" w:cs="Consolas"/>
+          <w:sz w:val="28"/>
+          <w:szCs w:val="28"/>
+        </w:rPr>
+        <w:t>"""</w:t>
+      </w:r>
+    </w:p>
+    <w:p>
+      <w:pPr>
+        <w:shd w:val="clear" w:color="auto" w:fill="EDF1F8"/>
+        <w:spacing w:after="40" w:line="264" w:lineRule="auto"/>
+        <w:ind w:left="200" w:right="200"/>
+        <w:rPr>
+          <w:sz w:val="28"/>
+          <w:szCs w:val="28"/>
+        </w:rPr>
+      </w:pPr>
+      <w:r>
+        <w:rPr>
+          <w:rFonts w:ascii="Consolas" w:eastAsia="Consolas" w:hAnsi="Consolas" w:cs="Consolas"/>
+          <w:sz w:val="28"/>
+          <w:szCs w:val="28"/>
+        </w:rPr>
+        <w:t>{</w:t>
+      </w:r>
+      <w:proofErr w:type="spellStart"/>
+      <w:proofErr w:type="gramStart"/>
+      <w:r>
+        <w:rPr>
+          <w:rFonts w:ascii="Consolas" w:eastAsia="Consolas" w:hAnsi="Consolas" w:cs="Consolas"/>
+          <w:sz w:val="28"/>
+          <w:szCs w:val="28"/>
+        </w:rPr>
+        <w:t>retours</w:t>
+      </w:r>
+      <w:proofErr w:type="gramEnd"/>
+      <w:r>
+        <w:rPr>
+          <w:rFonts w:ascii="Consolas" w:eastAsia="Consolas" w:hAnsi="Consolas" w:cs="Consolas"/>
+          <w:sz w:val="28"/>
+          <w:szCs w:val="28"/>
+        </w:rPr>
+        <w:t>_clients</w:t>
+      </w:r>
+      <w:proofErr w:type="spellEnd"/>
+      <w:r>
+        <w:rPr>
+          <w:rFonts w:ascii="Consolas" w:eastAsia="Consolas" w:hAnsi="Consolas" w:cs="Consolas"/>
+          <w:sz w:val="28"/>
+          <w:szCs w:val="28"/>
+        </w:rPr>
+        <w:t>}</w:t>
+      </w:r>
+    </w:p>
+    <w:p>
+      <w:pPr>
+        <w:shd w:val="clear" w:color="auto" w:fill="EDF1F8"/>
+        <w:spacing w:after="40" w:line="264" w:lineRule="auto"/>
+        <w:ind w:left="200" w:right="200"/>
+        <w:rPr>
+          <w:sz w:val="28"/>
+          <w:szCs w:val="28"/>
+        </w:rPr>
+      </w:pPr>
+      <w:r>
+        <w:rPr>
+          <w:rFonts w:ascii="Consolas" w:eastAsia="Consolas" w:hAnsi="Consolas" w:cs="Consolas"/>
+          <w:sz w:val="28"/>
+          <w:szCs w:val="28"/>
+        </w:rPr>
+        <w:t>"""</w:t>
+      </w:r>
+    </w:p>
+    <w:p>
+      <w:pPr>
+        <w:shd w:val="clear" w:color="auto" w:fill="EDF1F8"/>
+        <w:spacing w:after="40" w:line="264" w:lineRule="auto"/>
+        <w:ind w:left="200" w:right="200"/>
+        <w:rPr>
+          <w:sz w:val="28"/>
+          <w:szCs w:val="28"/>
+        </w:rPr>
+      </w:pPr>
+    </w:p>
+    <w:p>
+      <w:pPr>
+        <w:shd w:val="clear" w:color="auto" w:fill="EDF1F8"/>
+        <w:spacing w:after="40" w:line="264" w:lineRule="auto"/>
+        <w:ind w:left="200" w:right="200"/>
+        <w:rPr>
+          <w:sz w:val="28"/>
+          <w:szCs w:val="28"/>
+        </w:rPr>
+      </w:pPr>
+      <w:r>
+        <w:rPr>
+          <w:rFonts w:ascii="Consolas" w:eastAsia="Consolas" w:hAnsi="Consolas" w:cs="Consolas"/>
+          <w:sz w:val="28"/>
+          <w:szCs w:val="28"/>
+        </w:rPr>
+        <w:t>Tâche : Analyse ces retours et produis une synthèse exploitable par l'équipe</w:t>
+      </w:r>
+      <w:r>
+        <w:rPr>
+          <w:sz w:val="28"/>
+          <w:szCs w:val="28"/>
+        </w:rPr>
+        <w:t xml:space="preserve"> </w:t>
+      </w:r>
+      <w:r>
+        <w:rPr>
+          <w:rFonts w:ascii="Consolas" w:eastAsia="Consolas" w:hAnsi="Consolas" w:cs="Consolas"/>
+          <w:sz w:val="28"/>
+          <w:szCs w:val="28"/>
+        </w:rPr>
+        <w:t>produit. Identifie : le sentiment global, les thèmes récurrents, les problèmes</w:t>
+      </w:r>
+      <w:r>
+        <w:rPr>
+          <w:sz w:val="28"/>
+          <w:szCs w:val="28"/>
+        </w:rPr>
+        <w:t xml:space="preserve"> </w:t>
+      </w:r>
+      <w:r>
+        <w:rPr>
+          <w:rFonts w:ascii="Consolas" w:eastAsia="Consolas" w:hAnsi="Consolas" w:cs="Consolas"/>
+          <w:sz w:val="28"/>
+          <w:szCs w:val="28"/>
+        </w:rPr>
+        <w:t>les plus fréquemment mentionnés, et les points positifs à conserver.</w:t>
+      </w:r>
+    </w:p>
+    <w:p>
+      <w:pPr>
+        <w:shd w:val="clear" w:color="auto" w:fill="EDF1F8"/>
+        <w:spacing w:after="40" w:line="264" w:lineRule="auto"/>
+        <w:ind w:left="200" w:right="200"/>
+        <w:rPr>
+          <w:sz w:val="28"/>
+          <w:szCs w:val="28"/>
+        </w:rPr>
+      </w:pPr>
+    </w:p>
+    <w:p>
+      <w:pPr>
+        <w:shd w:val="clear" w:color="auto" w:fill="EDF1F8"/>
+        <w:spacing w:after="40" w:line="264" w:lineRule="auto"/>
+        <w:ind w:left="200" w:right="200"/>
+        <w:rPr>
+          <w:sz w:val="28"/>
+          <w:szCs w:val="28"/>
+        </w:rPr>
+      </w:pPr>
+      <w:r>
+        <w:rPr>
+          <w:rFonts w:ascii="Consolas" w:eastAsia="Consolas" w:hAnsi="Consolas" w:cs="Consolas"/>
+          <w:sz w:val="28"/>
+          <w:szCs w:val="28"/>
+        </w:rPr>
+        <w:t>Contraintes :</w:t>
+      </w:r>
+    </w:p>
+    <w:p>
+      <w:pPr>
+        <w:shd w:val="clear" w:color="auto" w:fill="EDF1F8"/>
+        <w:spacing w:after="40" w:line="264" w:lineRule="auto"/>
+        <w:ind w:left="200" w:right="200"/>
+        <w:rPr>
+          <w:sz w:val="28"/>
+          <w:szCs w:val="28"/>
+        </w:rPr>
+      </w:pPr>
+      <w:r>
+        <w:rPr>
+          <w:rFonts w:ascii="Consolas" w:eastAsia="Consolas" w:hAnsi="Consolas" w:cs="Consolas"/>
+          <w:sz w:val="28"/>
+          <w:szCs w:val="28"/>
+        </w:rPr>
+        <w:t>- Base-toi uniquement sur le contenu des retours fournis, sans inventer d'information.</w:t>
+      </w:r>
+    </w:p>
+    <w:p>
+      <w:pPr>
+        <w:shd w:val="clear" w:color="auto" w:fill="EDF1F8"/>
+        <w:spacing w:after="40" w:line="264" w:lineRule="auto"/>
+        <w:ind w:left="200" w:right="200"/>
+        <w:rPr>
+          <w:sz w:val="28"/>
+          <w:szCs w:val="28"/>
+        </w:rPr>
+      </w:pPr>
+      <w:r>
+        <w:rPr>
+          <w:rFonts w:ascii="Consolas" w:eastAsia="Consolas" w:hAnsi="Consolas" w:cs="Consolas"/>
+          <w:sz w:val="28"/>
+          <w:szCs w:val="28"/>
+        </w:rPr>
+        <w:t>- Si un retour est ambigu, classe-le comme "neutre" plutôt que de forcer une</w:t>
+      </w:r>
+      <w:r>
+        <w:rPr>
+          <w:sz w:val="28"/>
+          <w:szCs w:val="28"/>
+        </w:rPr>
+        <w:t xml:space="preserve"> </w:t>
+      </w:r>
+      <w:r>
+        <w:rPr>
+          <w:rFonts w:ascii="Consolas" w:eastAsia="Consolas" w:hAnsi="Consolas" w:cs="Consolas"/>
+          <w:sz w:val="28"/>
+          <w:szCs w:val="28"/>
+        </w:rPr>
+        <w:t>interprétation.</w:t>
+      </w:r>
+    </w:p>
+    <w:p>
+      <w:pPr>
+        <w:shd w:val="clear" w:color="auto" w:fill="EDF1F8"/>
+        <w:spacing w:after="40" w:line="264" w:lineRule="auto"/>
+        <w:ind w:left="200" w:right="200"/>
+        <w:rPr>
+          <w:sz w:val="28"/>
+          <w:szCs w:val="28"/>
+        </w:rPr>
+      </w:pPr>
+      <w:r>
+        <w:rPr>
+          <w:rFonts w:ascii="Consolas" w:eastAsia="Consolas" w:hAnsi="Consolas" w:cs="Consolas"/>
+          <w:sz w:val="28"/>
+          <w:szCs w:val="28"/>
+        </w:rPr>
+        <w:t>- Cite le nombre approximatif de retours concernés par chaque thème.</w:t>
+      </w:r>
+    </w:p>
+    <w:p>
+      <w:pPr>
+        <w:shd w:val="clear" w:color="auto" w:fill="EDF1F8"/>
+        <w:spacing w:after="40" w:line="264" w:lineRule="auto"/>
+        <w:ind w:left="200" w:right="200"/>
+        <w:rPr>
+          <w:sz w:val="28"/>
+          <w:szCs w:val="28"/>
+        </w:rPr>
+      </w:pPr>
+      <w:r>
+        <w:rPr>
+          <w:rFonts w:ascii="Consolas" w:eastAsia="Consolas" w:hAnsi="Consolas" w:cs="Consolas"/>
+          <w:sz w:val="28"/>
+          <w:szCs w:val="28"/>
+        </w:rPr>
+        <w:t>- Reste factuel, sans jugement de valeur sur les clients ou l'entreprise.</w:t>
+      </w:r>
+    </w:p>
+    <w:p>
+      <w:pPr>
+        <w:shd w:val="clear" w:color="auto" w:fill="EDF1F8"/>
+        <w:spacing w:after="40" w:line="264" w:lineRule="auto"/>
+        <w:ind w:left="200" w:right="200"/>
+        <w:rPr>
+          <w:sz w:val="28"/>
+          <w:szCs w:val="28"/>
+        </w:rPr>
+      </w:pPr>
+    </w:p>
+    <w:p>
+      <w:pPr>
+        <w:shd w:val="clear" w:color="auto" w:fill="EDF1F8"/>
+        <w:spacing w:after="40" w:line="264" w:lineRule="auto"/>
+        <w:ind w:left="200" w:right="200"/>
+        <w:rPr>
+          <w:sz w:val="28"/>
+          <w:szCs w:val="28"/>
+        </w:rPr>
+      </w:pPr>
+      <w:r>
+        <w:rPr>
+          <w:rFonts w:ascii="Consolas" w:eastAsia="Consolas" w:hAnsi="Consolas" w:cs="Consolas"/>
+          <w:sz w:val="28"/>
+          <w:szCs w:val="28"/>
+        </w:rPr>
+        <w:t>Format de sortie : une synthèse structurée en 4 sections (Sentiment global,</w:t>
+      </w:r>
+    </w:p>
+    <w:p>
+      <w:pPr>
+        <w:shd w:val="clear" w:color="auto" w:fill="EDF1F8"/>
+        <w:spacing w:after="40" w:line="264" w:lineRule="auto"/>
+        <w:ind w:left="200" w:right="200"/>
+        <w:rPr>
+          <w:sz w:val="28"/>
+          <w:szCs w:val="28"/>
+        </w:rPr>
+      </w:pPr>
+      <w:r>
+        <w:rPr>
+          <w:rFonts w:ascii="Consolas" w:eastAsia="Consolas" w:hAnsi="Consolas" w:cs="Consolas"/>
+          <w:sz w:val="28"/>
+          <w:szCs w:val="28"/>
+        </w:rPr>
+        <w:t>Thèmes récurrents, Problèmes prioritaires, Points positifs), suivie d'une liste</w:t>
+      </w:r>
+      <w:r>
+        <w:rPr>
+          <w:sz w:val="28"/>
+          <w:szCs w:val="28"/>
+        </w:rPr>
+        <w:t xml:space="preserve"> </w:t>
+      </w:r>
+      <w:r>
+        <w:rPr>
+          <w:rFonts w:ascii="Consolas" w:eastAsia="Consolas" w:hAnsi="Consolas" w:cs="Consolas"/>
+          <w:sz w:val="28"/>
+          <w:szCs w:val="28"/>
+        </w:rPr>
+        <w:t>de 3 recommandations concrètes classées par priorité.</w:t>
+      </w:r>
+    </w:p>
+    <w:p>
+      <w:pPr>
+        <w:spacing w:after="160" w:line="288" w:lineRule="auto"/>
+        <w:rPr>
+          <w:sz w:val="28"/>
+          <w:szCs w:val="28"/>
+        </w:rPr>
+      </w:pPr>
+    </w:p>
+    <w:p>
+      <w:pPr>
+        <w:rPr>
+          <w:sz w:val="28"/>
+          <w:szCs w:val="28"/>
+        </w:rPr>
+      </w:pPr>
+    </w:p>
     <w:sectPr>
       <w:pgSz w:w="11906" w:h="16838"/>
       <w:pgMar w:top="1417" w:right="1417" w:bottom="1417" w:left="1417" w:header="708" w:footer="708" w:gutter="0"/>

</xml_diff>

<commit_message>
Partie 5 :  Prompts pour les applications métier
</commit_message>
<xml_diff>
--- a/ai-business_assistant/Atelier Prompt Engineering.docx
+++ b/ai-business_assistant/Atelier Prompt Engineering.docx
@@ -2999,7 +2999,14 @@
           <w:sz w:val="24"/>
           <w:szCs w:val="24"/>
         </w:rPr>
-        <w:t>respect des contraintes.</w:t>
+        <w:t>respect des contraintes</w:t>
+      </w:r>
+      <w:r>
+        <w:rPr>
+          <w:sz w:val="24"/>
+          <w:szCs w:val="24"/>
+        </w:rPr>
+        <w:t> ?</w:t>
       </w:r>
     </w:p>
     <w:p>
@@ -4149,6 +4156,13 @@
         </w:rPr>
         <w:t xml:space="preserve"> les types des valeurs et les valeurs autorisées</w:t>
       </w:r>
+      <w:r>
+        <w:rPr>
+          <w:sz w:val="24"/>
+          <w:szCs w:val="24"/>
+        </w:rPr>
+        <w:t> ?</w:t>
+      </w:r>
     </w:p>
     <w:p/>
     <w:p>
@@ -4858,7 +4872,14 @@
           <w:sz w:val="24"/>
           <w:szCs w:val="24"/>
         </w:rPr>
-        <w:t>compris entre 0 et 1 ; urgence vaut faible, moyenne ou élevée.</w:t>
+        <w:t>compris entre 0 et 1 ; urgence vaut faible, moyenne ou élevée</w:t>
+      </w:r>
+      <w:r>
+        <w:rPr>
+          <w:sz w:val="24"/>
+          <w:szCs w:val="24"/>
+        </w:rPr>
+        <w:t> ?</w:t>
       </w:r>
     </w:p>
     <w:p/>
@@ -5472,6 +5493,2596 @@
                     <a:xfrm>
                       <a:off x="0" y="0"/>
                       <a:ext cx="5760720" cy="1583690"/>
+                    </a:xfrm>
+                    <a:prstGeom prst="rect">
+                      <a:avLst/>
+                    </a:prstGeom>
+                  </pic:spPr>
+                </pic:pic>
+              </a:graphicData>
+            </a:graphic>
+          </wp:inline>
+        </w:drawing>
+      </w:r>
+    </w:p>
+    <w:p>
+      <w:pPr>
+        <w:spacing w:after="80" w:line="276" w:lineRule="auto"/>
+        <w:rPr>
+          <w:sz w:val="24"/>
+          <w:szCs w:val="24"/>
+        </w:rPr>
+      </w:pPr>
+    </w:p>
+    <w:p>
+      <w:pPr>
+        <w:pStyle w:val="Titre1"/>
+        <w:pBdr>
+          <w:bottom w:val="single" w:sz="6" w:space="4" w:color="2E5090"/>
+        </w:pBdr>
+      </w:pPr>
+      <w:r>
+        <w:t>Partie 5</w:t>
+      </w:r>
+      <w:r>
+        <w:t> :</w:t>
+      </w:r>
+      <w:r>
+        <w:t xml:space="preserve">  Prompts pour les applications métier</w:t>
+      </w:r>
+    </w:p>
+    <w:p>
+      <w:pPr>
+        <w:spacing w:after="80" w:line="276" w:lineRule="auto"/>
+        <w:rPr>
+          <w:sz w:val="24"/>
+          <w:szCs w:val="24"/>
+        </w:rPr>
+      </w:pPr>
+      <w:r>
+        <w:rPr>
+          <w:sz w:val="24"/>
+          <w:szCs w:val="24"/>
+        </w:rPr>
+        <w:t xml:space="preserve"> </w:t>
+      </w:r>
+    </w:p>
+    <w:p>
+      <w:pPr>
+        <w:pStyle w:val="Titre2"/>
+        <w:ind w:firstLine="708"/>
+      </w:pPr>
+      <w:r>
+        <w:t>1) Résumé de document</w:t>
+      </w:r>
+    </w:p>
+    <w:p>
+      <w:pPr>
+        <w:rPr>
+          <w:sz w:val="24"/>
+          <w:szCs w:val="24"/>
+        </w:rPr>
+      </w:pPr>
+      <w:r>
+        <w:rPr>
+          <w:sz w:val="24"/>
+          <w:szCs w:val="24"/>
+        </w:rPr>
+        <w:t>Créer un prompt permettant de résumer un document avec les contraintes : maximum 250</w:t>
+      </w:r>
+      <w:r>
+        <w:rPr>
+          <w:sz w:val="24"/>
+          <w:szCs w:val="24"/>
+        </w:rPr>
+        <w:t xml:space="preserve"> </w:t>
+      </w:r>
+      <w:r>
+        <w:rPr>
+          <w:sz w:val="24"/>
+          <w:szCs w:val="24"/>
+        </w:rPr>
+        <w:t>mots ; conserver les informations factuelles ; identifier les objectifs ; identifier les résultats ;</w:t>
+      </w:r>
+      <w:r>
+        <w:rPr>
+          <w:sz w:val="24"/>
+          <w:szCs w:val="24"/>
+        </w:rPr>
+        <w:t xml:space="preserve"> </w:t>
+      </w:r>
+      <w:r>
+        <w:rPr>
+          <w:sz w:val="24"/>
+          <w:szCs w:val="24"/>
+        </w:rPr>
+        <w:t>identifier les recommandations ; n'inventer aucune information</w:t>
+      </w:r>
+      <w:r>
+        <w:rPr>
+          <w:sz w:val="24"/>
+          <w:szCs w:val="24"/>
+        </w:rPr>
+        <w:t> ?</w:t>
+      </w:r>
+    </w:p>
+    <w:p/>
+    <w:p>
+      <w:pPr>
+        <w:shd w:val="clear" w:color="auto" w:fill="2E5090"/>
+        <w:spacing w:before="120"/>
+        <w:rPr>
+          <w:sz w:val="24"/>
+          <w:szCs w:val="24"/>
+        </w:rPr>
+      </w:pPr>
+      <w:r>
+        <w:rPr>
+          <w:b/>
+          <w:bCs/>
+          <w:color w:val="FFFFFF"/>
+          <w:sz w:val="24"/>
+          <w:szCs w:val="24"/>
+        </w:rPr>
+        <w:t xml:space="preserve">  PROMPT</w:t>
+      </w:r>
+    </w:p>
+    <w:p>
+      <w:pPr>
+        <w:shd w:val="clear" w:color="auto" w:fill="EDF1F8"/>
+        <w:spacing w:after="40" w:line="264" w:lineRule="auto"/>
+        <w:ind w:left="200" w:right="200"/>
+        <w:rPr>
+          <w:sz w:val="24"/>
+          <w:szCs w:val="24"/>
+        </w:rPr>
+      </w:pPr>
+      <w:r>
+        <w:rPr>
+          <w:rFonts w:ascii="Consolas" w:eastAsia="Consolas" w:hAnsi="Consolas" w:cs="Consolas"/>
+          <w:sz w:val="24"/>
+          <w:szCs w:val="24"/>
+        </w:rPr>
+        <w:t>Résume le document suivant en respectant strictement ces contraintes :</w:t>
+      </w:r>
+    </w:p>
+    <w:p>
+      <w:pPr>
+        <w:shd w:val="clear" w:color="auto" w:fill="EDF1F8"/>
+        <w:spacing w:after="40" w:line="264" w:lineRule="auto"/>
+        <w:ind w:left="200" w:right="200"/>
+        <w:rPr>
+          <w:sz w:val="24"/>
+          <w:szCs w:val="24"/>
+        </w:rPr>
+      </w:pPr>
+      <w:r>
+        <w:rPr>
+          <w:rFonts w:ascii="Consolas" w:eastAsia="Consolas" w:hAnsi="Consolas" w:cs="Consolas"/>
+          <w:sz w:val="24"/>
+          <w:szCs w:val="24"/>
+        </w:rPr>
+        <w:t>- Maximum 250 mots.</w:t>
+      </w:r>
+    </w:p>
+    <w:p>
+      <w:pPr>
+        <w:shd w:val="clear" w:color="auto" w:fill="EDF1F8"/>
+        <w:spacing w:after="40" w:line="264" w:lineRule="auto"/>
+        <w:ind w:left="200" w:right="200"/>
+        <w:rPr>
+          <w:sz w:val="24"/>
+          <w:szCs w:val="24"/>
+        </w:rPr>
+      </w:pPr>
+      <w:r>
+        <w:rPr>
+          <w:rFonts w:ascii="Consolas" w:eastAsia="Consolas" w:hAnsi="Consolas" w:cs="Consolas"/>
+          <w:sz w:val="24"/>
+          <w:szCs w:val="24"/>
+        </w:rPr>
+        <w:t>- Conserve uniquement les informations factuelles présentes dans le texte.</w:t>
+      </w:r>
+    </w:p>
+    <w:p>
+      <w:pPr>
+        <w:shd w:val="clear" w:color="auto" w:fill="EDF1F8"/>
+        <w:spacing w:after="40" w:line="264" w:lineRule="auto"/>
+        <w:ind w:left="200" w:right="200"/>
+        <w:rPr>
+          <w:sz w:val="24"/>
+          <w:szCs w:val="24"/>
+        </w:rPr>
+      </w:pPr>
+      <w:r>
+        <w:rPr>
+          <w:rFonts w:ascii="Consolas" w:eastAsia="Consolas" w:hAnsi="Consolas" w:cs="Consolas"/>
+          <w:sz w:val="24"/>
+          <w:szCs w:val="24"/>
+        </w:rPr>
+        <w:lastRenderedPageBreak/>
+        <w:t>- Identifie clairement les objectifs poursuivis par le document.</w:t>
+      </w:r>
+    </w:p>
+    <w:p>
+      <w:pPr>
+        <w:shd w:val="clear" w:color="auto" w:fill="EDF1F8"/>
+        <w:spacing w:after="40" w:line="264" w:lineRule="auto"/>
+        <w:ind w:left="200" w:right="200"/>
+        <w:rPr>
+          <w:sz w:val="24"/>
+          <w:szCs w:val="24"/>
+        </w:rPr>
+      </w:pPr>
+      <w:r>
+        <w:rPr>
+          <w:rFonts w:ascii="Consolas" w:eastAsia="Consolas" w:hAnsi="Consolas" w:cs="Consolas"/>
+          <w:sz w:val="24"/>
+          <w:szCs w:val="24"/>
+        </w:rPr>
+        <w:t>- Identifie les résultats obtenus ou constatés.</w:t>
+      </w:r>
+    </w:p>
+    <w:p>
+      <w:pPr>
+        <w:shd w:val="clear" w:color="auto" w:fill="EDF1F8"/>
+        <w:spacing w:after="40" w:line="264" w:lineRule="auto"/>
+        <w:ind w:left="200" w:right="200"/>
+        <w:rPr>
+          <w:sz w:val="24"/>
+          <w:szCs w:val="24"/>
+        </w:rPr>
+      </w:pPr>
+      <w:r>
+        <w:rPr>
+          <w:rFonts w:ascii="Consolas" w:eastAsia="Consolas" w:hAnsi="Consolas" w:cs="Consolas"/>
+          <w:sz w:val="24"/>
+          <w:szCs w:val="24"/>
+        </w:rPr>
+        <w:t>- Identifie les recommandations formulées, s'il y en a.</w:t>
+      </w:r>
+    </w:p>
+    <w:p>
+      <w:pPr>
+        <w:shd w:val="clear" w:color="auto" w:fill="EDF1F8"/>
+        <w:spacing w:after="40" w:line="264" w:lineRule="auto"/>
+        <w:ind w:left="200" w:right="200"/>
+        <w:rPr>
+          <w:sz w:val="24"/>
+          <w:szCs w:val="24"/>
+        </w:rPr>
+      </w:pPr>
+      <w:r>
+        <w:rPr>
+          <w:rFonts w:ascii="Consolas" w:eastAsia="Consolas" w:hAnsi="Consolas" w:cs="Consolas"/>
+          <w:sz w:val="24"/>
+          <w:szCs w:val="24"/>
+        </w:rPr>
+        <w:t>- N'invente aucune information absente du document.</w:t>
+      </w:r>
+    </w:p>
+    <w:p>
+      <w:pPr>
+        <w:shd w:val="clear" w:color="auto" w:fill="EDF1F8"/>
+        <w:spacing w:after="40" w:line="264" w:lineRule="auto"/>
+        <w:ind w:left="200" w:right="200"/>
+        <w:rPr>
+          <w:sz w:val="24"/>
+          <w:szCs w:val="24"/>
+        </w:rPr>
+      </w:pPr>
+    </w:p>
+    <w:p>
+      <w:pPr>
+        <w:shd w:val="clear" w:color="auto" w:fill="EDF1F8"/>
+        <w:spacing w:after="40" w:line="264" w:lineRule="auto"/>
+        <w:ind w:left="200" w:right="200"/>
+        <w:rPr>
+          <w:sz w:val="24"/>
+          <w:szCs w:val="24"/>
+        </w:rPr>
+      </w:pPr>
+      <w:r>
+        <w:rPr>
+          <w:rFonts w:ascii="Consolas" w:eastAsia="Consolas" w:hAnsi="Consolas" w:cs="Consolas"/>
+          <w:sz w:val="24"/>
+          <w:szCs w:val="24"/>
+        </w:rPr>
+        <w:t>Structure attendue : Objectifs / Résultats / Recommandations.</w:t>
+      </w:r>
+    </w:p>
+    <w:p>
+      <w:pPr>
+        <w:shd w:val="clear" w:color="auto" w:fill="EDF1F8"/>
+        <w:spacing w:after="40" w:line="264" w:lineRule="auto"/>
+        <w:ind w:left="200" w:right="200"/>
+        <w:rPr>
+          <w:sz w:val="24"/>
+          <w:szCs w:val="24"/>
+        </w:rPr>
+      </w:pPr>
+    </w:p>
+    <w:p>
+      <w:pPr>
+        <w:shd w:val="clear" w:color="auto" w:fill="EDF1F8"/>
+        <w:spacing w:after="40" w:line="264" w:lineRule="auto"/>
+        <w:ind w:left="200" w:right="200"/>
+        <w:rPr>
+          <w:sz w:val="24"/>
+          <w:szCs w:val="24"/>
+        </w:rPr>
+      </w:pPr>
+      <w:r>
+        <w:rPr>
+          <w:rFonts w:ascii="Consolas" w:eastAsia="Consolas" w:hAnsi="Consolas" w:cs="Consolas"/>
+          <w:sz w:val="24"/>
+          <w:szCs w:val="24"/>
+        </w:rPr>
+        <w:t>Document :</w:t>
+      </w:r>
+    </w:p>
+    <w:p>
+      <w:pPr>
+        <w:shd w:val="clear" w:color="auto" w:fill="EDF1F8"/>
+        <w:spacing w:after="40" w:line="264" w:lineRule="auto"/>
+        <w:ind w:left="200" w:right="200"/>
+        <w:rPr>
+          <w:sz w:val="24"/>
+          <w:szCs w:val="24"/>
+        </w:rPr>
+      </w:pPr>
+      <w:r>
+        <w:rPr>
+          <w:rFonts w:ascii="Consolas" w:eastAsia="Consolas" w:hAnsi="Consolas" w:cs="Consolas"/>
+          <w:sz w:val="24"/>
+          <w:szCs w:val="24"/>
+        </w:rPr>
+        <w:t>"""</w:t>
+      </w:r>
+    </w:p>
+    <w:p>
+      <w:pPr>
+        <w:shd w:val="clear" w:color="auto" w:fill="EDF1F8"/>
+        <w:spacing w:after="40" w:line="264" w:lineRule="auto"/>
+        <w:ind w:left="200" w:right="200"/>
+        <w:rPr>
+          <w:sz w:val="24"/>
+          <w:szCs w:val="24"/>
+        </w:rPr>
+      </w:pPr>
+      <w:r>
+        <w:rPr>
+          <w:rFonts w:ascii="Consolas" w:eastAsia="Consolas" w:hAnsi="Consolas" w:cs="Consolas"/>
+          <w:sz w:val="24"/>
+          <w:szCs w:val="24"/>
+        </w:rPr>
+        <w:t>{</w:t>
+      </w:r>
+      <w:proofErr w:type="gramStart"/>
+      <w:r>
+        <w:rPr>
+          <w:rFonts w:ascii="Consolas" w:eastAsia="Consolas" w:hAnsi="Consolas" w:cs="Consolas"/>
+          <w:sz w:val="24"/>
+          <w:szCs w:val="24"/>
+        </w:rPr>
+        <w:t>document</w:t>
+      </w:r>
+      <w:proofErr w:type="gramEnd"/>
+      <w:r>
+        <w:rPr>
+          <w:rFonts w:ascii="Consolas" w:eastAsia="Consolas" w:hAnsi="Consolas" w:cs="Consolas"/>
+          <w:sz w:val="24"/>
+          <w:szCs w:val="24"/>
+        </w:rPr>
+        <w:t>}</w:t>
+      </w:r>
+    </w:p>
+    <w:p>
+      <w:pPr>
+        <w:shd w:val="clear" w:color="auto" w:fill="EDF1F8"/>
+        <w:spacing w:line="264" w:lineRule="auto"/>
+        <w:ind w:left="200" w:right="200"/>
+        <w:rPr>
+          <w:sz w:val="24"/>
+          <w:szCs w:val="24"/>
+        </w:rPr>
+      </w:pPr>
+      <w:r>
+        <w:rPr>
+          <w:rFonts w:ascii="Consolas" w:eastAsia="Consolas" w:hAnsi="Consolas" w:cs="Consolas"/>
+          <w:sz w:val="24"/>
+          <w:szCs w:val="24"/>
+        </w:rPr>
+        <w:t>"""</w:t>
+      </w:r>
+    </w:p>
+    <w:p>
+      <w:pPr>
+        <w:spacing w:after="80" w:line="276" w:lineRule="auto"/>
+        <w:rPr>
+          <w:sz w:val="24"/>
+          <w:szCs w:val="24"/>
+        </w:rPr>
+      </w:pPr>
+    </w:p>
+    <w:p>
+      <w:pPr>
+        <w:spacing w:after="80" w:line="276" w:lineRule="auto"/>
+        <w:rPr>
+          <w:sz w:val="24"/>
+          <w:szCs w:val="24"/>
+        </w:rPr>
+      </w:pPr>
+      <w:r>
+        <w:rPr>
+          <w:sz w:val="24"/>
+          <w:szCs w:val="24"/>
+        </w:rPr>
+        <w:drawing>
+          <wp:inline distT="0" distB="0" distL="0" distR="0" wp14:anchorId="447BFF6B" wp14:editId="507F0B23">
+            <wp:extent cx="2540000" cy="1449358"/>
+            <wp:effectExtent l="0" t="0" r="0" b="0"/>
+            <wp:docPr id="2060079351" name="Image 1"/>
+            <wp:cNvGraphicFramePr>
+              <a:graphicFrameLocks xmlns:a="http://schemas.openxmlformats.org/drawingml/2006/main" noChangeAspect="1"/>
+            </wp:cNvGraphicFramePr>
+            <a:graphic xmlns:a="http://schemas.openxmlformats.org/drawingml/2006/main">
+              <a:graphicData uri="http://schemas.openxmlformats.org/drawingml/2006/picture">
+                <pic:pic xmlns:pic="http://schemas.openxmlformats.org/drawingml/2006/picture">
+                  <pic:nvPicPr>
+                    <pic:cNvPr id="2060079351" name=""/>
+                    <pic:cNvPicPr/>
+                  </pic:nvPicPr>
+                  <pic:blipFill rotWithShape="1">
+                    <a:blip r:embed="rId17"/>
+                    <a:srcRect l="13193" r="370"/>
+                    <a:stretch>
+                      <a:fillRect/>
+                    </a:stretch>
+                  </pic:blipFill>
+                  <pic:spPr bwMode="auto">
+                    <a:xfrm>
+                      <a:off x="0" y="0"/>
+                      <a:ext cx="2556205" cy="1458605"/>
+                    </a:xfrm>
+                    <a:prstGeom prst="rect">
+                      <a:avLst/>
+                    </a:prstGeom>
+                    <a:ln>
+                      <a:noFill/>
+                    </a:ln>
+                    <a:extLst>
+                      <a:ext uri="{53640926-AAD7-44D8-BBD7-CCE9431645EC}">
+                        <a14:shadowObscured xmlns:a14="http://schemas.microsoft.com/office/drawing/2010/main"/>
+                      </a:ext>
+                    </a:extLst>
+                  </pic:spPr>
+                </pic:pic>
+              </a:graphicData>
+            </a:graphic>
+          </wp:inline>
+        </w:drawing>
+      </w:r>
+      <w:r>
+        <w:rPr>
+          <w:sz w:val="24"/>
+          <w:szCs w:val="24"/>
+        </w:rPr>
+        <w:drawing>
+          <wp:inline distT="0" distB="0" distL="0" distR="0" wp14:anchorId="630051BC" wp14:editId="7FDA0F47">
+            <wp:extent cx="3204845" cy="1461017"/>
+            <wp:effectExtent l="0" t="0" r="0" b="6350"/>
+            <wp:docPr id="911659187" name="Image 1"/>
+            <wp:cNvGraphicFramePr>
+              <a:graphicFrameLocks xmlns:a="http://schemas.openxmlformats.org/drawingml/2006/main" noChangeAspect="1"/>
+            </wp:cNvGraphicFramePr>
+            <a:graphic xmlns:a="http://schemas.openxmlformats.org/drawingml/2006/main">
+              <a:graphicData uri="http://schemas.openxmlformats.org/drawingml/2006/picture">
+                <pic:pic xmlns:pic="http://schemas.openxmlformats.org/drawingml/2006/picture">
+                  <pic:nvPicPr>
+                    <pic:cNvPr id="911659187" name=""/>
+                    <pic:cNvPicPr/>
+                  </pic:nvPicPr>
+                  <pic:blipFill rotWithShape="1">
+                    <a:blip r:embed="rId18"/>
+                    <a:srcRect l="12015" r="3439" b="4200"/>
+                    <a:stretch>
+                      <a:fillRect/>
+                    </a:stretch>
+                  </pic:blipFill>
+                  <pic:spPr bwMode="auto">
+                    <a:xfrm>
+                      <a:off x="0" y="0"/>
+                      <a:ext cx="3233824" cy="1474228"/>
+                    </a:xfrm>
+                    <a:prstGeom prst="rect">
+                      <a:avLst/>
+                    </a:prstGeom>
+                    <a:ln>
+                      <a:noFill/>
+                    </a:ln>
+                    <a:extLst>
+                      <a:ext uri="{53640926-AAD7-44D8-BBD7-CCE9431645EC}">
+                        <a14:shadowObscured xmlns:a14="http://schemas.microsoft.com/office/drawing/2010/main"/>
+                      </a:ext>
+                    </a:extLst>
+                  </pic:spPr>
+                </pic:pic>
+              </a:graphicData>
+            </a:graphic>
+          </wp:inline>
+        </w:drawing>
+      </w:r>
+    </w:p>
+    <w:p>
+      <w:pPr>
+        <w:spacing w:after="80" w:line="276" w:lineRule="auto"/>
+        <w:rPr>
+          <w:sz w:val="24"/>
+          <w:szCs w:val="24"/>
+        </w:rPr>
+      </w:pPr>
+    </w:p>
+    <w:p>
+      <w:pPr>
+        <w:pStyle w:val="Titre2"/>
+        <w:ind w:firstLine="708"/>
+      </w:pPr>
+      <w:r>
+        <w:t>2) Traduction français → anglais</w:t>
+      </w:r>
+      <w:r>
+        <w:t> :</w:t>
+      </w:r>
+    </w:p>
+    <w:p>
+      <w:pPr>
+        <w:spacing w:after="80" w:line="276" w:lineRule="auto"/>
+        <w:rPr>
+          <w:sz w:val="24"/>
+          <w:szCs w:val="24"/>
+        </w:rPr>
+      </w:pPr>
+      <w:r>
+        <w:rPr>
+          <w:sz w:val="24"/>
+          <w:szCs w:val="24"/>
+        </w:rPr>
+        <w:t>Créer un prompt permettant de traduire un document français en anglais avec les</w:t>
+      </w:r>
+      <w:r>
+        <w:rPr>
+          <w:sz w:val="24"/>
+          <w:szCs w:val="24"/>
+        </w:rPr>
+        <w:t xml:space="preserve"> </w:t>
+      </w:r>
+      <w:r>
+        <w:rPr>
+          <w:sz w:val="24"/>
+          <w:szCs w:val="24"/>
+        </w:rPr>
+        <w:t>contraintes : conserver le sens ; conserver la structure ; conserver les termes techniques ; ne</w:t>
+      </w:r>
+      <w:r>
+        <w:rPr>
+          <w:sz w:val="24"/>
+          <w:szCs w:val="24"/>
+        </w:rPr>
+        <w:t xml:space="preserve"> </w:t>
+      </w:r>
+      <w:r>
+        <w:rPr>
+          <w:sz w:val="24"/>
+          <w:szCs w:val="24"/>
+        </w:rPr>
+        <w:t>pas résumer ; ne rajoute aucune information</w:t>
+      </w:r>
+      <w:r>
+        <w:rPr>
+          <w:sz w:val="24"/>
+          <w:szCs w:val="24"/>
+        </w:rPr>
+        <w:t> ?</w:t>
+      </w:r>
+    </w:p>
+    <w:p>
+      <w:pPr>
+        <w:spacing w:after="80" w:line="276" w:lineRule="auto"/>
+        <w:rPr>
+          <w:sz w:val="24"/>
+          <w:szCs w:val="24"/>
+        </w:rPr>
+      </w:pPr>
+      <w:r>
+        <w:rPr>
+          <w:b/>
+          <w:bCs/>
+          <w:color w:val="FFFFFF"/>
+          <w:sz w:val="18"/>
+          <w:szCs w:val="18"/>
+        </w:rPr>
+        <w:t>PROMPT</w:t>
+      </w:r>
+    </w:p>
+    <w:p>
+      <w:pPr>
+        <w:shd w:val="clear" w:color="auto" w:fill="2E5090"/>
+        <w:spacing w:before="120"/>
+      </w:pPr>
+      <w:r>
+        <w:rPr>
+          <w:b/>
+          <w:bCs/>
+          <w:color w:val="FFFFFF"/>
+          <w:sz w:val="18"/>
+          <w:szCs w:val="18"/>
+        </w:rPr>
+        <w:t xml:space="preserve">  PROMPT</w:t>
+      </w:r>
+    </w:p>
+    <w:p>
+      <w:pPr>
+        <w:shd w:val="clear" w:color="auto" w:fill="EDF1F8"/>
+        <w:spacing w:after="40" w:line="264" w:lineRule="auto"/>
+        <w:ind w:left="200" w:right="200"/>
+      </w:pPr>
+      <w:r>
+        <w:rPr>
+          <w:rFonts w:ascii="Consolas" w:eastAsia="Consolas" w:hAnsi="Consolas" w:cs="Consolas"/>
+          <w:sz w:val="20"/>
+          <w:szCs w:val="20"/>
+        </w:rPr>
+        <w:t>Traduis le document suivant du français vers l'anglais en respectant ces</w:t>
+      </w:r>
+      <w:r>
+        <w:t xml:space="preserve"> </w:t>
+      </w:r>
+      <w:r>
+        <w:rPr>
+          <w:rFonts w:ascii="Consolas" w:eastAsia="Consolas" w:hAnsi="Consolas" w:cs="Consolas"/>
+          <w:sz w:val="20"/>
+          <w:szCs w:val="20"/>
+        </w:rPr>
+        <w:t>contraintes :</w:t>
+      </w:r>
+    </w:p>
+    <w:p>
+      <w:pPr>
+        <w:shd w:val="clear" w:color="auto" w:fill="EDF1F8"/>
+        <w:spacing w:after="40" w:line="264" w:lineRule="auto"/>
+        <w:ind w:left="200" w:right="200"/>
+      </w:pPr>
+      <w:r>
+        <w:rPr>
+          <w:rFonts w:ascii="Consolas" w:eastAsia="Consolas" w:hAnsi="Consolas" w:cs="Consolas"/>
+          <w:sz w:val="20"/>
+          <w:szCs w:val="20"/>
+        </w:rPr>
+        <w:t>- Conserve le sens exact du texte source, sans interprétation libre.</w:t>
+      </w:r>
+    </w:p>
+    <w:p>
+      <w:pPr>
+        <w:shd w:val="clear" w:color="auto" w:fill="EDF1F8"/>
+        <w:spacing w:after="40" w:line="264" w:lineRule="auto"/>
+        <w:ind w:left="200" w:right="200"/>
+      </w:pPr>
+      <w:r>
+        <w:rPr>
+          <w:rFonts w:ascii="Consolas" w:eastAsia="Consolas" w:hAnsi="Consolas" w:cs="Consolas"/>
+          <w:sz w:val="20"/>
+          <w:szCs w:val="20"/>
+        </w:rPr>
+        <w:t>- Conserve la structure du document (titres, paragraphes, listes).</w:t>
+      </w:r>
+    </w:p>
+    <w:p>
+      <w:pPr>
+        <w:shd w:val="clear" w:color="auto" w:fill="EDF1F8"/>
+        <w:spacing w:after="40" w:line="264" w:lineRule="auto"/>
+        <w:ind w:left="200" w:right="200"/>
+      </w:pPr>
+      <w:r>
+        <w:rPr>
+          <w:rFonts w:ascii="Consolas" w:eastAsia="Consolas" w:hAnsi="Consolas" w:cs="Consolas"/>
+          <w:sz w:val="20"/>
+          <w:szCs w:val="20"/>
+        </w:rPr>
+        <w:t>- Conserve les termes techniques dans leur forme standard en anglais</w:t>
+      </w:r>
+      <w:r>
+        <w:t xml:space="preserve"> </w:t>
+      </w:r>
+      <w:r>
+        <w:rPr>
+          <w:rFonts w:ascii="Consolas" w:eastAsia="Consolas" w:hAnsi="Consolas" w:cs="Consolas"/>
+          <w:sz w:val="20"/>
+          <w:szCs w:val="20"/>
+        </w:rPr>
+        <w:t>(ne les traduis pas mot à mot si un équivalent technique établi existe).</w:t>
+      </w:r>
+    </w:p>
+    <w:p>
+      <w:pPr>
+        <w:shd w:val="clear" w:color="auto" w:fill="EDF1F8"/>
+        <w:spacing w:after="40" w:line="264" w:lineRule="auto"/>
+        <w:ind w:left="200" w:right="200"/>
+      </w:pPr>
+      <w:r>
+        <w:rPr>
+          <w:rFonts w:ascii="Consolas" w:eastAsia="Consolas" w:hAnsi="Consolas" w:cs="Consolas"/>
+          <w:sz w:val="20"/>
+          <w:szCs w:val="20"/>
+        </w:rPr>
+        <w:t>- Ne résume pas le contenu : la traduction doit être intégrale.</w:t>
+      </w:r>
+    </w:p>
+    <w:p>
+      <w:pPr>
+        <w:shd w:val="clear" w:color="auto" w:fill="EDF1F8"/>
+        <w:spacing w:after="40" w:line="264" w:lineRule="auto"/>
+        <w:ind w:left="200" w:right="200"/>
+      </w:pPr>
+      <w:r>
+        <w:rPr>
+          <w:rFonts w:ascii="Consolas" w:eastAsia="Consolas" w:hAnsi="Consolas" w:cs="Consolas"/>
+          <w:sz w:val="20"/>
+          <w:szCs w:val="20"/>
+        </w:rPr>
+        <w:t>- N'ajoute aucune information, note ou commentaire absent du texte source.</w:t>
+      </w:r>
+    </w:p>
+    <w:p>
+      <w:pPr>
+        <w:shd w:val="clear" w:color="auto" w:fill="EDF1F8"/>
+        <w:spacing w:after="40" w:line="264" w:lineRule="auto"/>
+        <w:ind w:left="200" w:right="200"/>
+      </w:pPr>
+    </w:p>
+    <w:p>
+      <w:pPr>
+        <w:shd w:val="clear" w:color="auto" w:fill="EDF1F8"/>
+        <w:spacing w:after="40" w:line="264" w:lineRule="auto"/>
+        <w:ind w:left="200" w:right="200"/>
+      </w:pPr>
+      <w:r>
+        <w:rPr>
+          <w:rFonts w:ascii="Consolas" w:eastAsia="Consolas" w:hAnsi="Consolas" w:cs="Consolas"/>
+          <w:sz w:val="20"/>
+          <w:szCs w:val="20"/>
+        </w:rPr>
+        <w:t>Document à traduire :</w:t>
+      </w:r>
+    </w:p>
+    <w:p>
+      <w:pPr>
+        <w:shd w:val="clear" w:color="auto" w:fill="EDF1F8"/>
+        <w:spacing w:after="40" w:line="264" w:lineRule="auto"/>
+        <w:ind w:left="200" w:right="200"/>
+      </w:pPr>
+      <w:r>
+        <w:rPr>
+          <w:rFonts w:ascii="Consolas" w:eastAsia="Consolas" w:hAnsi="Consolas" w:cs="Consolas"/>
+          <w:sz w:val="20"/>
+          <w:szCs w:val="20"/>
+        </w:rPr>
+        <w:t>"""</w:t>
+      </w:r>
+    </w:p>
+    <w:p>
+      <w:pPr>
+        <w:shd w:val="clear" w:color="auto" w:fill="EDF1F8"/>
+        <w:spacing w:after="40" w:line="264" w:lineRule="auto"/>
+        <w:ind w:left="200" w:right="200"/>
+      </w:pPr>
+      <w:r>
+        <w:rPr>
+          <w:rFonts w:ascii="Consolas" w:eastAsia="Consolas" w:hAnsi="Consolas" w:cs="Consolas"/>
+          <w:sz w:val="20"/>
+          <w:szCs w:val="20"/>
+        </w:rPr>
+        <w:t>{</w:t>
+      </w:r>
+      <w:proofErr w:type="gramStart"/>
+      <w:r>
+        <w:rPr>
+          <w:rFonts w:ascii="Consolas" w:eastAsia="Consolas" w:hAnsi="Consolas" w:cs="Consolas"/>
+          <w:sz w:val="20"/>
+          <w:szCs w:val="20"/>
+        </w:rPr>
+        <w:t>document</w:t>
+      </w:r>
+      <w:proofErr w:type="gramEnd"/>
+      <w:r>
+        <w:rPr>
+          <w:rFonts w:ascii="Consolas" w:eastAsia="Consolas" w:hAnsi="Consolas" w:cs="Consolas"/>
+          <w:sz w:val="20"/>
+          <w:szCs w:val="20"/>
+        </w:rPr>
+        <w:t>}</w:t>
+      </w:r>
+    </w:p>
+    <w:p>
+      <w:pPr>
+        <w:shd w:val="clear" w:color="auto" w:fill="EDF1F8"/>
+        <w:spacing w:line="264" w:lineRule="auto"/>
+        <w:ind w:left="200" w:right="200"/>
+      </w:pPr>
+      <w:r>
+        <w:rPr>
+          <w:rFonts w:ascii="Consolas" w:eastAsia="Consolas" w:hAnsi="Consolas" w:cs="Consolas"/>
+          <w:sz w:val="20"/>
+          <w:szCs w:val="20"/>
+        </w:rPr>
+        <w:t>"""</w:t>
+      </w:r>
+    </w:p>
+    <w:p>
+      <w:pPr>
+        <w:spacing w:after="80" w:line="276" w:lineRule="auto"/>
+        <w:rPr>
+          <w:sz w:val="24"/>
+          <w:szCs w:val="24"/>
+        </w:rPr>
+      </w:pPr>
+    </w:p>
+    <w:p>
+      <w:pPr>
+        <w:spacing w:after="80" w:line="276" w:lineRule="auto"/>
+        <w:rPr>
+          <w:sz w:val="24"/>
+          <w:szCs w:val="24"/>
+        </w:rPr>
+      </w:pPr>
+      <w:r>
+        <w:rPr>
+          <w:sz w:val="24"/>
+          <w:szCs w:val="24"/>
+        </w:rPr>
+        <w:lastRenderedPageBreak/>
+        <w:drawing>
+          <wp:inline distT="0" distB="0" distL="0" distR="0" wp14:anchorId="3AC5A90C" wp14:editId="3B62084B">
+            <wp:extent cx="5760720" cy="2007870"/>
+            <wp:effectExtent l="0" t="0" r="0" b="0"/>
+            <wp:docPr id="1760164276" name="Image 1"/>
+            <wp:cNvGraphicFramePr>
+              <a:graphicFrameLocks xmlns:a="http://schemas.openxmlformats.org/drawingml/2006/main" noChangeAspect="1"/>
+            </wp:cNvGraphicFramePr>
+            <a:graphic xmlns:a="http://schemas.openxmlformats.org/drawingml/2006/main">
+              <a:graphicData uri="http://schemas.openxmlformats.org/drawingml/2006/picture">
+                <pic:pic xmlns:pic="http://schemas.openxmlformats.org/drawingml/2006/picture">
+                  <pic:nvPicPr>
+                    <pic:cNvPr id="1760164276" name=""/>
+                    <pic:cNvPicPr/>
+                  </pic:nvPicPr>
+                  <pic:blipFill>
+                    <a:blip r:embed="rId19"/>
+                    <a:stretch>
+                      <a:fillRect/>
+                    </a:stretch>
+                  </pic:blipFill>
+                  <pic:spPr>
+                    <a:xfrm>
+                      <a:off x="0" y="0"/>
+                      <a:ext cx="5760720" cy="2007870"/>
+                    </a:xfrm>
+                    <a:prstGeom prst="rect">
+                      <a:avLst/>
+                    </a:prstGeom>
+                  </pic:spPr>
+                </pic:pic>
+              </a:graphicData>
+            </a:graphic>
+          </wp:inline>
+        </w:drawing>
+      </w:r>
+    </w:p>
+    <w:p>
+      <w:pPr>
+        <w:spacing w:after="80" w:line="276" w:lineRule="auto"/>
+        <w:rPr>
+          <w:sz w:val="24"/>
+          <w:szCs w:val="24"/>
+        </w:rPr>
+      </w:pPr>
+    </w:p>
+    <w:p>
+      <w:pPr>
+        <w:pStyle w:val="Titre2"/>
+        <w:ind w:firstLine="708"/>
+      </w:pPr>
+      <w:r>
+        <w:t>3) Classification d'un ticket informatique</w:t>
+      </w:r>
+    </w:p>
+    <w:p>
+      <w:pPr>
+        <w:spacing w:after="80" w:line="276" w:lineRule="auto"/>
+        <w:rPr>
+          <w:sz w:val="24"/>
+          <w:szCs w:val="24"/>
+        </w:rPr>
+      </w:pPr>
+      <w:r>
+        <w:rPr>
+          <w:sz w:val="24"/>
+          <w:szCs w:val="24"/>
+        </w:rPr>
+        <w:t>Créer un prompt permettant de classer un ticket informatique dans une catégorie (réseau,</w:t>
+      </w:r>
+      <w:r>
+        <w:rPr>
+          <w:sz w:val="24"/>
+          <w:szCs w:val="24"/>
+        </w:rPr>
+        <w:t xml:space="preserve"> </w:t>
+      </w:r>
+      <w:r>
+        <w:rPr>
+          <w:sz w:val="24"/>
+          <w:szCs w:val="24"/>
+        </w:rPr>
+        <w:t>logiciel, matériel, sécurité, accès, autre). La réponse est au format JSON avec les champs</w:t>
+      </w:r>
+      <w:r>
+        <w:rPr>
+          <w:sz w:val="24"/>
+          <w:szCs w:val="24"/>
+        </w:rPr>
+        <w:t xml:space="preserve"> </w:t>
+      </w:r>
+      <w:r>
+        <w:rPr>
+          <w:sz w:val="24"/>
+          <w:szCs w:val="24"/>
+        </w:rPr>
+        <w:t>catégorie</w:t>
+      </w:r>
+      <w:r>
+        <w:rPr>
+          <w:sz w:val="24"/>
+          <w:szCs w:val="24"/>
+        </w:rPr>
+        <w:t xml:space="preserve"> et justification</w:t>
+      </w:r>
+      <w:r>
+        <w:rPr>
+          <w:sz w:val="24"/>
+          <w:szCs w:val="24"/>
+        </w:rPr>
+        <w:t> ?</w:t>
+      </w:r>
+    </w:p>
+    <w:p>
+      <w:pPr>
+        <w:shd w:val="clear" w:color="auto" w:fill="2E5090"/>
+        <w:spacing w:before="120"/>
+      </w:pPr>
+      <w:r>
+        <w:rPr>
+          <w:b/>
+          <w:bCs/>
+          <w:color w:val="FFFFFF"/>
+          <w:sz w:val="18"/>
+          <w:szCs w:val="18"/>
+        </w:rPr>
+        <w:t xml:space="preserve">  PROMPT</w:t>
+      </w:r>
+    </w:p>
+    <w:p>
+      <w:pPr>
+        <w:shd w:val="clear" w:color="auto" w:fill="EDF1F8"/>
+        <w:spacing w:after="40" w:line="264" w:lineRule="auto"/>
+        <w:ind w:left="200" w:right="200"/>
+      </w:pPr>
+      <w:r>
+        <w:rPr>
+          <w:rFonts w:ascii="Consolas" w:eastAsia="Consolas" w:hAnsi="Consolas" w:cs="Consolas"/>
+          <w:sz w:val="20"/>
+          <w:szCs w:val="20"/>
+        </w:rPr>
+        <w:t>Classe le ticket informatique suivant dans l'une des catégories autorisées :</w:t>
+      </w:r>
+      <w:r>
+        <w:t xml:space="preserve"> </w:t>
+      </w:r>
+      <w:r>
+        <w:rPr>
+          <w:rFonts w:ascii="Consolas" w:eastAsia="Consolas" w:hAnsi="Consolas" w:cs="Consolas"/>
+          <w:sz w:val="20"/>
+          <w:szCs w:val="20"/>
+        </w:rPr>
+        <w:t>réseau, logiciel, matériel, sécurité, accès, autre.</w:t>
+      </w:r>
+    </w:p>
+    <w:p>
+      <w:pPr>
+        <w:shd w:val="clear" w:color="auto" w:fill="EDF1F8"/>
+        <w:spacing w:after="40" w:line="264" w:lineRule="auto"/>
+        <w:ind w:left="200" w:right="200"/>
+      </w:pPr>
+    </w:p>
+    <w:p>
+      <w:pPr>
+        <w:shd w:val="clear" w:color="auto" w:fill="EDF1F8"/>
+        <w:spacing w:after="40" w:line="264" w:lineRule="auto"/>
+        <w:ind w:left="200" w:right="200"/>
+      </w:pPr>
+      <w:r>
+        <w:rPr>
+          <w:rFonts w:ascii="Consolas" w:eastAsia="Consolas" w:hAnsi="Consolas" w:cs="Consolas"/>
+          <w:sz w:val="20"/>
+          <w:szCs w:val="20"/>
+        </w:rPr>
+        <w:t>Ticket : "{</w:t>
+      </w:r>
+      <w:proofErr w:type="spellStart"/>
+      <w:r>
+        <w:rPr>
+          <w:rFonts w:ascii="Consolas" w:eastAsia="Consolas" w:hAnsi="Consolas" w:cs="Consolas"/>
+          <w:sz w:val="20"/>
+          <w:szCs w:val="20"/>
+        </w:rPr>
+        <w:t>description_ticket</w:t>
+      </w:r>
+      <w:proofErr w:type="spellEnd"/>
+      <w:r>
+        <w:rPr>
+          <w:rFonts w:ascii="Consolas" w:eastAsia="Consolas" w:hAnsi="Consolas" w:cs="Consolas"/>
+          <w:sz w:val="20"/>
+          <w:szCs w:val="20"/>
+        </w:rPr>
+        <w:t>}"</w:t>
+      </w:r>
+    </w:p>
+    <w:p>
+      <w:pPr>
+        <w:shd w:val="clear" w:color="auto" w:fill="EDF1F8"/>
+        <w:spacing w:after="40" w:line="264" w:lineRule="auto"/>
+        <w:ind w:left="200" w:right="200"/>
+      </w:pPr>
+    </w:p>
+    <w:p>
+      <w:pPr>
+        <w:shd w:val="clear" w:color="auto" w:fill="EDF1F8"/>
+        <w:spacing w:after="40" w:line="264" w:lineRule="auto"/>
+        <w:ind w:left="200" w:right="200"/>
+      </w:pPr>
+      <w:r>
+        <w:rPr>
+          <w:rFonts w:ascii="Consolas" w:eastAsia="Consolas" w:hAnsi="Consolas" w:cs="Consolas"/>
+          <w:sz w:val="20"/>
+          <w:szCs w:val="20"/>
+        </w:rPr>
+        <w:t>Retourne uniquement un JSON valide avec les champs suivants :</w:t>
+      </w:r>
+    </w:p>
+    <w:p>
+      <w:pPr>
+        <w:shd w:val="clear" w:color="auto" w:fill="EDF1F8"/>
+        <w:spacing w:after="40" w:line="264" w:lineRule="auto"/>
+        <w:ind w:left="200" w:right="200"/>
+      </w:pPr>
+      <w:r>
+        <w:rPr>
+          <w:rFonts w:ascii="Consolas" w:eastAsia="Consolas" w:hAnsi="Consolas" w:cs="Consolas"/>
+          <w:sz w:val="20"/>
+          <w:szCs w:val="20"/>
+        </w:rPr>
+        <w:t>{</w:t>
+      </w:r>
+    </w:p>
+    <w:p>
+      <w:pPr>
+        <w:shd w:val="clear" w:color="auto" w:fill="EDF1F8"/>
+        <w:spacing w:after="40" w:line="264" w:lineRule="auto"/>
+        <w:ind w:left="200" w:right="200"/>
+      </w:pPr>
+      <w:r>
+        <w:rPr>
+          <w:rFonts w:ascii="Consolas" w:eastAsia="Consolas" w:hAnsi="Consolas" w:cs="Consolas"/>
+          <w:sz w:val="20"/>
+          <w:szCs w:val="20"/>
+        </w:rPr>
+        <w:t xml:space="preserve">  "</w:t>
+      </w:r>
+      <w:proofErr w:type="spellStart"/>
+      <w:r>
+        <w:rPr>
+          <w:rFonts w:ascii="Consolas" w:eastAsia="Consolas" w:hAnsi="Consolas" w:cs="Consolas"/>
+          <w:sz w:val="20"/>
+          <w:szCs w:val="20"/>
+        </w:rPr>
+        <w:t>categorie</w:t>
+      </w:r>
+      <w:proofErr w:type="spellEnd"/>
+      <w:r>
+        <w:rPr>
+          <w:rFonts w:ascii="Consolas" w:eastAsia="Consolas" w:hAnsi="Consolas" w:cs="Consolas"/>
+          <w:sz w:val="20"/>
+          <w:szCs w:val="20"/>
+        </w:rPr>
+        <w:t xml:space="preserve"> » :</w:t>
+      </w:r>
+      <w:r>
+        <w:rPr>
+          <w:rFonts w:ascii="Consolas" w:eastAsia="Consolas" w:hAnsi="Consolas" w:cs="Consolas"/>
+          <w:sz w:val="20"/>
+          <w:szCs w:val="20"/>
+        </w:rPr>
+        <w:t xml:space="preserve"> "</w:t>
+      </w:r>
+      <w:proofErr w:type="spellStart"/>
+      <w:r>
+        <w:rPr>
+          <w:rFonts w:ascii="Consolas" w:eastAsia="Consolas" w:hAnsi="Consolas" w:cs="Consolas"/>
+          <w:sz w:val="20"/>
+          <w:szCs w:val="20"/>
+        </w:rPr>
+        <w:t>réseau|logiciel|matériel|sécurité|accès|autre</w:t>
+      </w:r>
+      <w:proofErr w:type="spellEnd"/>
+      <w:r>
+        <w:rPr>
+          <w:rFonts w:ascii="Consolas" w:eastAsia="Consolas" w:hAnsi="Consolas" w:cs="Consolas"/>
+          <w:sz w:val="20"/>
+          <w:szCs w:val="20"/>
+        </w:rPr>
+        <w:t>",</w:t>
+      </w:r>
+    </w:p>
+    <w:p>
+      <w:pPr>
+        <w:shd w:val="clear" w:color="auto" w:fill="EDF1F8"/>
+        <w:spacing w:after="40" w:line="264" w:lineRule="auto"/>
+        <w:ind w:left="200" w:right="200"/>
+      </w:pPr>
+      <w:r>
+        <w:rPr>
+          <w:rFonts w:ascii="Consolas" w:eastAsia="Consolas" w:hAnsi="Consolas" w:cs="Consolas"/>
+          <w:sz w:val="20"/>
+          <w:szCs w:val="20"/>
+        </w:rPr>
+        <w:t xml:space="preserve">  "</w:t>
+      </w:r>
+      <w:r>
+        <w:rPr>
+          <w:rFonts w:ascii="Consolas" w:eastAsia="Consolas" w:hAnsi="Consolas" w:cs="Consolas"/>
+          <w:sz w:val="20"/>
+          <w:szCs w:val="20"/>
+        </w:rPr>
+        <w:t>justification » :</w:t>
+      </w:r>
+      <w:r>
+        <w:rPr>
+          <w:rFonts w:ascii="Consolas" w:eastAsia="Consolas" w:hAnsi="Consolas" w:cs="Consolas"/>
+          <w:sz w:val="20"/>
+          <w:szCs w:val="20"/>
+        </w:rPr>
+        <w:t xml:space="preserve"> "&lt;1 à 2 phrases expliquant le choix&gt;"</w:t>
+      </w:r>
+    </w:p>
+    <w:p>
+      <w:pPr>
+        <w:shd w:val="clear" w:color="auto" w:fill="EDF1F8"/>
+        <w:spacing w:line="264" w:lineRule="auto"/>
+        <w:ind w:left="200" w:right="200"/>
+      </w:pPr>
+      <w:r>
+        <w:rPr>
+          <w:rFonts w:ascii="Consolas" w:eastAsia="Consolas" w:hAnsi="Consolas" w:cs="Consolas"/>
+          <w:sz w:val="20"/>
+          <w:szCs w:val="20"/>
+        </w:rPr>
+        <w:t>}</w:t>
+      </w:r>
+    </w:p>
+    <w:p>
+      <w:pPr>
+        <w:spacing w:after="80" w:line="276" w:lineRule="auto"/>
+        <w:rPr>
+          <w:sz w:val="24"/>
+          <w:szCs w:val="24"/>
+        </w:rPr>
+      </w:pPr>
+    </w:p>
+    <w:p>
+      <w:pPr>
+        <w:spacing w:after="80" w:line="276" w:lineRule="auto"/>
+        <w:rPr>
+          <w:sz w:val="24"/>
+          <w:szCs w:val="24"/>
+        </w:rPr>
+      </w:pPr>
+      <w:r>
+        <w:rPr>
+          <w:sz w:val="24"/>
+          <w:szCs w:val="24"/>
+        </w:rPr>
+        <w:drawing>
+          <wp:inline distT="0" distB="0" distL="0" distR="0" wp14:anchorId="573BC9C4" wp14:editId="5A2CB12F">
+            <wp:extent cx="5760720" cy="2319655"/>
+            <wp:effectExtent l="0" t="0" r="0" b="4445"/>
+            <wp:docPr id="1251584949" name="Image 1"/>
+            <wp:cNvGraphicFramePr>
+              <a:graphicFrameLocks xmlns:a="http://schemas.openxmlformats.org/drawingml/2006/main" noChangeAspect="1"/>
+            </wp:cNvGraphicFramePr>
+            <a:graphic xmlns:a="http://schemas.openxmlformats.org/drawingml/2006/main">
+              <a:graphicData uri="http://schemas.openxmlformats.org/drawingml/2006/picture">
+                <pic:pic xmlns:pic="http://schemas.openxmlformats.org/drawingml/2006/picture">
+                  <pic:nvPicPr>
+                    <pic:cNvPr id="1251584949" name=""/>
+                    <pic:cNvPicPr/>
+                  </pic:nvPicPr>
+                  <pic:blipFill>
+                    <a:blip r:embed="rId20"/>
+                    <a:stretch>
+                      <a:fillRect/>
+                    </a:stretch>
+                  </pic:blipFill>
+                  <pic:spPr>
+                    <a:xfrm>
+                      <a:off x="0" y="0"/>
+                      <a:ext cx="5760720" cy="2319655"/>
+                    </a:xfrm>
+                    <a:prstGeom prst="rect">
+                      <a:avLst/>
+                    </a:prstGeom>
+                  </pic:spPr>
+                </pic:pic>
+              </a:graphicData>
+            </a:graphic>
+          </wp:inline>
+        </w:drawing>
+      </w:r>
+    </w:p>
+    <w:p>
+      <w:pPr>
+        <w:pStyle w:val="Titre2"/>
+        <w:ind w:firstLine="708"/>
+      </w:pPr>
+      <w:r>
+        <w:lastRenderedPageBreak/>
+        <w:t>4) Extraction d'informations d'une facture</w:t>
+      </w:r>
+      <w:r>
+        <w:t> :</w:t>
+      </w:r>
+    </w:p>
+    <w:p>
+      <w:pPr>
+        <w:rPr>
+          <w:sz w:val="24"/>
+          <w:szCs w:val="24"/>
+        </w:rPr>
+      </w:pPr>
+      <w:r>
+        <w:rPr>
+          <w:sz w:val="24"/>
+          <w:szCs w:val="24"/>
+        </w:rPr>
+        <w:t>Créer un prompt permettant d’extraire, à partir d’une facture, les infos (</w:t>
+      </w:r>
+      <w:proofErr w:type="spellStart"/>
+      <w:r>
+        <w:rPr>
+          <w:sz w:val="24"/>
+          <w:szCs w:val="24"/>
+        </w:rPr>
+        <w:t>numéro_facture</w:t>
+      </w:r>
+      <w:proofErr w:type="spellEnd"/>
+      <w:r>
+        <w:rPr>
+          <w:sz w:val="24"/>
+          <w:szCs w:val="24"/>
+        </w:rPr>
+        <w:t>,</w:t>
+      </w:r>
+      <w:r>
+        <w:rPr>
+          <w:sz w:val="24"/>
+          <w:szCs w:val="24"/>
+        </w:rPr>
+        <w:t xml:space="preserve"> </w:t>
+      </w:r>
+      <w:r>
+        <w:rPr>
+          <w:sz w:val="24"/>
+          <w:szCs w:val="24"/>
+        </w:rPr>
+        <w:t xml:space="preserve">date, client, </w:t>
+      </w:r>
+      <w:proofErr w:type="spellStart"/>
+      <w:r>
+        <w:rPr>
+          <w:sz w:val="24"/>
+          <w:szCs w:val="24"/>
+        </w:rPr>
+        <w:t>montant_ht</w:t>
+      </w:r>
+      <w:proofErr w:type="spellEnd"/>
+      <w:r>
+        <w:rPr>
+          <w:sz w:val="24"/>
+          <w:szCs w:val="24"/>
+        </w:rPr>
+        <w:t xml:space="preserve">, tva, </w:t>
+      </w:r>
+      <w:proofErr w:type="spellStart"/>
+      <w:r>
+        <w:rPr>
+          <w:sz w:val="24"/>
+          <w:szCs w:val="24"/>
+        </w:rPr>
+        <w:t>montant_ttc</w:t>
+      </w:r>
+      <w:proofErr w:type="spellEnd"/>
+      <w:r>
+        <w:rPr>
+          <w:sz w:val="24"/>
+          <w:szCs w:val="24"/>
+        </w:rPr>
+        <w:t xml:space="preserve">). Retourner uniquement un JSON valide avec </w:t>
+      </w:r>
+      <w:proofErr w:type="spellStart"/>
+      <w:r>
+        <w:rPr>
+          <w:sz w:val="24"/>
+          <w:szCs w:val="24"/>
+        </w:rPr>
+        <w:t>null</w:t>
+      </w:r>
+      <w:proofErr w:type="spellEnd"/>
+      <w:r>
+        <w:rPr>
+          <w:sz w:val="24"/>
+          <w:szCs w:val="24"/>
+        </w:rPr>
+        <w:t xml:space="preserve"> </w:t>
+      </w:r>
+      <w:r>
+        <w:rPr>
+          <w:sz w:val="24"/>
+          <w:szCs w:val="24"/>
+        </w:rPr>
+        <w:t>si une info est absente</w:t>
+      </w:r>
+      <w:r>
+        <w:rPr>
+          <w:sz w:val="24"/>
+          <w:szCs w:val="24"/>
+        </w:rPr>
+        <w:t> ?</w:t>
+      </w:r>
+    </w:p>
+    <w:p>
+      <w:pPr>
+        <w:rPr>
+          <w:sz w:val="24"/>
+          <w:szCs w:val="24"/>
+        </w:rPr>
+      </w:pPr>
+    </w:p>
+    <w:p>
+      <w:pPr>
+        <w:shd w:val="clear" w:color="auto" w:fill="2E5090"/>
+        <w:spacing w:before="120"/>
+        <w:rPr>
+          <w:sz w:val="24"/>
+          <w:szCs w:val="24"/>
+        </w:rPr>
+      </w:pPr>
+      <w:r>
+        <w:rPr>
+          <w:b/>
+          <w:bCs/>
+          <w:color w:val="FFFFFF"/>
+          <w:sz w:val="24"/>
+          <w:szCs w:val="24"/>
+        </w:rPr>
+        <w:t>PROMPT</w:t>
+      </w:r>
+    </w:p>
+    <w:p>
+      <w:pPr>
+        <w:shd w:val="clear" w:color="auto" w:fill="EDF1F8"/>
+        <w:spacing w:after="40" w:line="264" w:lineRule="auto"/>
+        <w:ind w:left="200" w:right="200"/>
+        <w:rPr>
+          <w:sz w:val="24"/>
+          <w:szCs w:val="24"/>
+        </w:rPr>
+      </w:pPr>
+      <w:r>
+        <w:rPr>
+          <w:rFonts w:ascii="Consolas" w:eastAsia="Consolas" w:hAnsi="Consolas" w:cs="Consolas"/>
+          <w:sz w:val="24"/>
+          <w:szCs w:val="24"/>
+        </w:rPr>
+        <w:t>Extrait les informations suivantes à partir de la facture ci-dessous :</w:t>
+      </w:r>
+    </w:p>
+    <w:p>
+      <w:pPr>
+        <w:shd w:val="clear" w:color="auto" w:fill="EDF1F8"/>
+        <w:spacing w:after="40" w:line="264" w:lineRule="auto"/>
+        <w:ind w:left="200" w:right="200"/>
+        <w:rPr>
+          <w:sz w:val="24"/>
+          <w:szCs w:val="24"/>
+        </w:rPr>
+      </w:pPr>
+      <w:proofErr w:type="spellStart"/>
+      <w:proofErr w:type="gramStart"/>
+      <w:r>
+        <w:rPr>
+          <w:rFonts w:ascii="Consolas" w:eastAsia="Consolas" w:hAnsi="Consolas" w:cs="Consolas"/>
+          <w:sz w:val="24"/>
+          <w:szCs w:val="24"/>
+        </w:rPr>
+        <w:t>numéro</w:t>
+      </w:r>
+      <w:proofErr w:type="gramEnd"/>
+      <w:r>
+        <w:rPr>
+          <w:rFonts w:ascii="Consolas" w:eastAsia="Consolas" w:hAnsi="Consolas" w:cs="Consolas"/>
+          <w:sz w:val="24"/>
+          <w:szCs w:val="24"/>
+        </w:rPr>
+        <w:t>_facture</w:t>
+      </w:r>
+      <w:proofErr w:type="spellEnd"/>
+      <w:r>
+        <w:rPr>
+          <w:rFonts w:ascii="Consolas" w:eastAsia="Consolas" w:hAnsi="Consolas" w:cs="Consolas"/>
+          <w:sz w:val="24"/>
+          <w:szCs w:val="24"/>
+        </w:rPr>
+        <w:t xml:space="preserve">, date, client, </w:t>
+      </w:r>
+      <w:proofErr w:type="spellStart"/>
+      <w:r>
+        <w:rPr>
+          <w:rFonts w:ascii="Consolas" w:eastAsia="Consolas" w:hAnsi="Consolas" w:cs="Consolas"/>
+          <w:sz w:val="24"/>
+          <w:szCs w:val="24"/>
+        </w:rPr>
+        <w:t>montant_ht</w:t>
+      </w:r>
+      <w:proofErr w:type="spellEnd"/>
+      <w:r>
+        <w:rPr>
+          <w:rFonts w:ascii="Consolas" w:eastAsia="Consolas" w:hAnsi="Consolas" w:cs="Consolas"/>
+          <w:sz w:val="24"/>
+          <w:szCs w:val="24"/>
+        </w:rPr>
+        <w:t xml:space="preserve">, tva, </w:t>
+      </w:r>
+      <w:proofErr w:type="spellStart"/>
+      <w:r>
+        <w:rPr>
+          <w:rFonts w:ascii="Consolas" w:eastAsia="Consolas" w:hAnsi="Consolas" w:cs="Consolas"/>
+          <w:sz w:val="24"/>
+          <w:szCs w:val="24"/>
+        </w:rPr>
+        <w:t>montant_ttc</w:t>
+      </w:r>
+      <w:proofErr w:type="spellEnd"/>
+      <w:r>
+        <w:rPr>
+          <w:rFonts w:ascii="Consolas" w:eastAsia="Consolas" w:hAnsi="Consolas" w:cs="Consolas"/>
+          <w:sz w:val="24"/>
+          <w:szCs w:val="24"/>
+        </w:rPr>
+        <w:t>.</w:t>
+      </w:r>
+    </w:p>
+    <w:p>
+      <w:pPr>
+        <w:shd w:val="clear" w:color="auto" w:fill="EDF1F8"/>
+        <w:spacing w:after="40" w:line="264" w:lineRule="auto"/>
+        <w:ind w:left="200" w:right="200"/>
+        <w:rPr>
+          <w:sz w:val="24"/>
+          <w:szCs w:val="24"/>
+        </w:rPr>
+      </w:pPr>
+    </w:p>
+    <w:p>
+      <w:pPr>
+        <w:shd w:val="clear" w:color="auto" w:fill="EDF1F8"/>
+        <w:spacing w:after="40" w:line="264" w:lineRule="auto"/>
+        <w:ind w:left="200" w:right="200"/>
+        <w:rPr>
+          <w:sz w:val="24"/>
+          <w:szCs w:val="24"/>
+        </w:rPr>
+      </w:pPr>
+      <w:r>
+        <w:rPr>
+          <w:rFonts w:ascii="Consolas" w:eastAsia="Consolas" w:hAnsi="Consolas" w:cs="Consolas"/>
+          <w:sz w:val="24"/>
+          <w:szCs w:val="24"/>
+        </w:rPr>
+        <w:t>Contraintes :</w:t>
+      </w:r>
+    </w:p>
+    <w:p>
+      <w:pPr>
+        <w:shd w:val="clear" w:color="auto" w:fill="EDF1F8"/>
+        <w:spacing w:after="40" w:line="264" w:lineRule="auto"/>
+        <w:ind w:left="200" w:right="200"/>
+        <w:rPr>
+          <w:sz w:val="24"/>
+          <w:szCs w:val="24"/>
+        </w:rPr>
+      </w:pPr>
+      <w:r>
+        <w:rPr>
+          <w:rFonts w:ascii="Consolas" w:eastAsia="Consolas" w:hAnsi="Consolas" w:cs="Consolas"/>
+          <w:sz w:val="24"/>
+          <w:szCs w:val="24"/>
+        </w:rPr>
+        <w:t>- Retourne uniquement un JSON valide, sans texte additionnel.</w:t>
+      </w:r>
+    </w:p>
+    <w:p>
+      <w:pPr>
+        <w:shd w:val="clear" w:color="auto" w:fill="EDF1F8"/>
+        <w:spacing w:after="40" w:line="264" w:lineRule="auto"/>
+        <w:ind w:left="200" w:right="200"/>
+        <w:rPr>
+          <w:sz w:val="24"/>
+          <w:szCs w:val="24"/>
+        </w:rPr>
+      </w:pPr>
+      <w:r>
+        <w:rPr>
+          <w:rFonts w:ascii="Consolas" w:eastAsia="Consolas" w:hAnsi="Consolas" w:cs="Consolas"/>
+          <w:sz w:val="24"/>
+          <w:szCs w:val="24"/>
+        </w:rPr>
+        <w:t xml:space="preserve">- Si une information est absente ou illisible, indique la valeur </w:t>
+      </w:r>
+      <w:proofErr w:type="spellStart"/>
+      <w:r>
+        <w:rPr>
+          <w:rFonts w:ascii="Consolas" w:eastAsia="Consolas" w:hAnsi="Consolas" w:cs="Consolas"/>
+          <w:sz w:val="24"/>
+          <w:szCs w:val="24"/>
+        </w:rPr>
+        <w:t>null</w:t>
+      </w:r>
+      <w:proofErr w:type="spellEnd"/>
+      <w:r>
+        <w:rPr>
+          <w:sz w:val="24"/>
+          <w:szCs w:val="24"/>
+        </w:rPr>
+        <w:t xml:space="preserve"> </w:t>
+      </w:r>
+      <w:r>
+        <w:rPr>
+          <w:rFonts w:ascii="Consolas" w:eastAsia="Consolas" w:hAnsi="Consolas" w:cs="Consolas"/>
+          <w:sz w:val="24"/>
+          <w:szCs w:val="24"/>
+        </w:rPr>
+        <w:t>pour ce champ (ne devine jamais une valeur).</w:t>
+      </w:r>
+    </w:p>
+    <w:p>
+      <w:pPr>
+        <w:shd w:val="clear" w:color="auto" w:fill="EDF1F8"/>
+        <w:spacing w:after="40" w:line="264" w:lineRule="auto"/>
+        <w:ind w:left="200" w:right="200"/>
+        <w:rPr>
+          <w:sz w:val="24"/>
+          <w:szCs w:val="24"/>
+        </w:rPr>
+      </w:pPr>
+      <w:r>
+        <w:rPr>
+          <w:rFonts w:ascii="Consolas" w:eastAsia="Consolas" w:hAnsi="Consolas" w:cs="Consolas"/>
+          <w:sz w:val="24"/>
+          <w:szCs w:val="24"/>
+        </w:rPr>
+        <w:t>- Les montants doivent être des nombres (pas de symbole monétaire, pas</w:t>
+      </w:r>
+      <w:r>
+        <w:rPr>
+          <w:sz w:val="24"/>
+          <w:szCs w:val="24"/>
+        </w:rPr>
+        <w:t xml:space="preserve"> </w:t>
+      </w:r>
+      <w:r>
+        <w:rPr>
+          <w:rFonts w:ascii="Consolas" w:eastAsia="Consolas" w:hAnsi="Consolas" w:cs="Consolas"/>
+          <w:sz w:val="24"/>
+          <w:szCs w:val="24"/>
+        </w:rPr>
+        <w:t>de séparateur de milliers).</w:t>
+      </w:r>
+    </w:p>
+    <w:p>
+      <w:pPr>
+        <w:shd w:val="clear" w:color="auto" w:fill="EDF1F8"/>
+        <w:spacing w:after="40" w:line="264" w:lineRule="auto"/>
+        <w:ind w:left="200" w:right="200"/>
+        <w:rPr>
+          <w:sz w:val="24"/>
+          <w:szCs w:val="24"/>
+        </w:rPr>
+      </w:pPr>
+    </w:p>
+    <w:p>
+      <w:pPr>
+        <w:shd w:val="clear" w:color="auto" w:fill="EDF1F8"/>
+        <w:spacing w:after="40" w:line="264" w:lineRule="auto"/>
+        <w:ind w:left="200" w:right="200"/>
+        <w:rPr>
+          <w:sz w:val="24"/>
+          <w:szCs w:val="24"/>
+        </w:rPr>
+      </w:pPr>
+      <w:r>
+        <w:rPr>
+          <w:rFonts w:ascii="Consolas" w:eastAsia="Consolas" w:hAnsi="Consolas" w:cs="Consolas"/>
+          <w:sz w:val="24"/>
+          <w:szCs w:val="24"/>
+        </w:rPr>
+        <w:t>Facture :</w:t>
+      </w:r>
+    </w:p>
+    <w:p>
+      <w:pPr>
+        <w:shd w:val="clear" w:color="auto" w:fill="EDF1F8"/>
+        <w:spacing w:after="40" w:line="264" w:lineRule="auto"/>
+        <w:ind w:left="200" w:right="200"/>
+        <w:rPr>
+          <w:sz w:val="24"/>
+          <w:szCs w:val="24"/>
+        </w:rPr>
+      </w:pPr>
+      <w:r>
+        <w:rPr>
+          <w:rFonts w:ascii="Consolas" w:eastAsia="Consolas" w:hAnsi="Consolas" w:cs="Consolas"/>
+          <w:sz w:val="24"/>
+          <w:szCs w:val="24"/>
+        </w:rPr>
+        <w:t>"""</w:t>
+      </w:r>
+    </w:p>
+    <w:p>
+      <w:pPr>
+        <w:shd w:val="clear" w:color="auto" w:fill="EDF1F8"/>
+        <w:spacing w:after="40" w:line="264" w:lineRule="auto"/>
+        <w:ind w:left="200" w:right="200"/>
+        <w:rPr>
+          <w:sz w:val="24"/>
+          <w:szCs w:val="24"/>
+        </w:rPr>
+      </w:pPr>
+      <w:r>
+        <w:rPr>
+          <w:rFonts w:ascii="Consolas" w:eastAsia="Consolas" w:hAnsi="Consolas" w:cs="Consolas"/>
+          <w:sz w:val="24"/>
+          <w:szCs w:val="24"/>
+        </w:rPr>
+        <w:t>{</w:t>
+      </w:r>
+      <w:proofErr w:type="spellStart"/>
+      <w:proofErr w:type="gramStart"/>
+      <w:r>
+        <w:rPr>
+          <w:rFonts w:ascii="Consolas" w:eastAsia="Consolas" w:hAnsi="Consolas" w:cs="Consolas"/>
+          <w:sz w:val="24"/>
+          <w:szCs w:val="24"/>
+        </w:rPr>
+        <w:t>texte</w:t>
+      </w:r>
+      <w:proofErr w:type="gramEnd"/>
+      <w:r>
+        <w:rPr>
+          <w:rFonts w:ascii="Consolas" w:eastAsia="Consolas" w:hAnsi="Consolas" w:cs="Consolas"/>
+          <w:sz w:val="24"/>
+          <w:szCs w:val="24"/>
+        </w:rPr>
+        <w:t>_facture</w:t>
+      </w:r>
+      <w:proofErr w:type="spellEnd"/>
+      <w:r>
+        <w:rPr>
+          <w:rFonts w:ascii="Consolas" w:eastAsia="Consolas" w:hAnsi="Consolas" w:cs="Consolas"/>
+          <w:sz w:val="24"/>
+          <w:szCs w:val="24"/>
+        </w:rPr>
+        <w:t>}</w:t>
+      </w:r>
+    </w:p>
+    <w:p>
+      <w:pPr>
+        <w:shd w:val="clear" w:color="auto" w:fill="EDF1F8"/>
+        <w:spacing w:after="40" w:line="264" w:lineRule="auto"/>
+        <w:ind w:left="200" w:right="200"/>
+        <w:rPr>
+          <w:sz w:val="24"/>
+          <w:szCs w:val="24"/>
+        </w:rPr>
+      </w:pPr>
+      <w:r>
+        <w:rPr>
+          <w:rFonts w:ascii="Consolas" w:eastAsia="Consolas" w:hAnsi="Consolas" w:cs="Consolas"/>
+          <w:sz w:val="24"/>
+          <w:szCs w:val="24"/>
+        </w:rPr>
+        <w:t>"""</w:t>
+      </w:r>
+    </w:p>
+    <w:p>
+      <w:pPr>
+        <w:shd w:val="clear" w:color="auto" w:fill="EDF1F8"/>
+        <w:spacing w:after="40" w:line="264" w:lineRule="auto"/>
+        <w:ind w:left="200" w:right="200"/>
+        <w:rPr>
+          <w:sz w:val="24"/>
+          <w:szCs w:val="24"/>
+        </w:rPr>
+      </w:pPr>
+    </w:p>
+    <w:p>
+      <w:pPr>
+        <w:shd w:val="clear" w:color="auto" w:fill="EDF1F8"/>
+        <w:spacing w:after="40" w:line="264" w:lineRule="auto"/>
+        <w:ind w:left="200" w:right="200"/>
+        <w:rPr>
+          <w:sz w:val="24"/>
+          <w:szCs w:val="24"/>
+        </w:rPr>
+      </w:pPr>
+      <w:r>
+        <w:rPr>
+          <w:rFonts w:ascii="Consolas" w:eastAsia="Consolas" w:hAnsi="Consolas" w:cs="Consolas"/>
+          <w:sz w:val="24"/>
+          <w:szCs w:val="24"/>
+        </w:rPr>
+        <w:t>Format de sortie :</w:t>
+      </w:r>
+    </w:p>
+    <w:p>
+      <w:pPr>
+        <w:shd w:val="clear" w:color="auto" w:fill="EDF1F8"/>
+        <w:spacing w:after="40" w:line="264" w:lineRule="auto"/>
+        <w:ind w:left="200" w:right="200"/>
+        <w:rPr>
+          <w:sz w:val="24"/>
+          <w:szCs w:val="24"/>
+        </w:rPr>
+      </w:pPr>
+      <w:r>
+        <w:rPr>
+          <w:rFonts w:ascii="Consolas" w:eastAsia="Consolas" w:hAnsi="Consolas" w:cs="Consolas"/>
+          <w:sz w:val="24"/>
+          <w:szCs w:val="24"/>
+        </w:rPr>
+        <w:t>{</w:t>
+      </w:r>
+    </w:p>
+    <w:p>
+      <w:pPr>
+        <w:shd w:val="clear" w:color="auto" w:fill="EDF1F8"/>
+        <w:spacing w:after="40" w:line="264" w:lineRule="auto"/>
+        <w:ind w:left="200" w:right="200"/>
+        <w:rPr>
+          <w:sz w:val="24"/>
+          <w:szCs w:val="24"/>
+        </w:rPr>
+      </w:pPr>
+      <w:r>
+        <w:rPr>
+          <w:rFonts w:ascii="Consolas" w:eastAsia="Consolas" w:hAnsi="Consolas" w:cs="Consolas"/>
+          <w:sz w:val="24"/>
+          <w:szCs w:val="24"/>
+        </w:rPr>
+        <w:t xml:space="preserve">  "</w:t>
+      </w:r>
+      <w:proofErr w:type="spellStart"/>
+      <w:r>
+        <w:rPr>
+          <w:rFonts w:ascii="Consolas" w:eastAsia="Consolas" w:hAnsi="Consolas" w:cs="Consolas"/>
+          <w:sz w:val="24"/>
+          <w:szCs w:val="24"/>
+        </w:rPr>
+        <w:t>numero_</w:t>
+      </w:r>
+      <w:r>
+        <w:rPr>
+          <w:rFonts w:ascii="Consolas" w:eastAsia="Consolas" w:hAnsi="Consolas" w:cs="Consolas"/>
+          <w:sz w:val="24"/>
+          <w:szCs w:val="24"/>
+        </w:rPr>
+        <w:t>facture</w:t>
+      </w:r>
+      <w:proofErr w:type="spellEnd"/>
+      <w:r>
+        <w:rPr>
+          <w:rFonts w:ascii="Consolas" w:eastAsia="Consolas" w:hAnsi="Consolas" w:cs="Consolas"/>
+          <w:sz w:val="24"/>
+          <w:szCs w:val="24"/>
+        </w:rPr>
+        <w:t xml:space="preserve"> » :</w:t>
+      </w:r>
+      <w:r>
+        <w:rPr>
+          <w:rFonts w:ascii="Consolas" w:eastAsia="Consolas" w:hAnsi="Consolas" w:cs="Consolas"/>
+          <w:sz w:val="24"/>
+          <w:szCs w:val="24"/>
+        </w:rPr>
+        <w:t xml:space="preserve"> </w:t>
+      </w:r>
+      <w:proofErr w:type="spellStart"/>
+      <w:r>
+        <w:rPr>
+          <w:rFonts w:ascii="Consolas" w:eastAsia="Consolas" w:hAnsi="Consolas" w:cs="Consolas"/>
+          <w:sz w:val="24"/>
+          <w:szCs w:val="24"/>
+        </w:rPr>
+        <w:t>string|null</w:t>
+      </w:r>
+      <w:proofErr w:type="spellEnd"/>
+      <w:r>
+        <w:rPr>
+          <w:rFonts w:ascii="Consolas" w:eastAsia="Consolas" w:hAnsi="Consolas" w:cs="Consolas"/>
+          <w:sz w:val="24"/>
+          <w:szCs w:val="24"/>
+        </w:rPr>
+        <w:t>,</w:t>
+      </w:r>
+    </w:p>
+    <w:p>
+      <w:pPr>
+        <w:shd w:val="clear" w:color="auto" w:fill="EDF1F8"/>
+        <w:spacing w:after="40" w:line="264" w:lineRule="auto"/>
+        <w:ind w:left="200" w:right="200"/>
+        <w:rPr>
+          <w:sz w:val="24"/>
+          <w:szCs w:val="24"/>
+        </w:rPr>
+      </w:pPr>
+      <w:r>
+        <w:rPr>
+          <w:rFonts w:ascii="Consolas" w:eastAsia="Consolas" w:hAnsi="Consolas" w:cs="Consolas"/>
+          <w:sz w:val="24"/>
+          <w:szCs w:val="24"/>
+        </w:rPr>
+        <w:t xml:space="preserve">  "</w:t>
+      </w:r>
+      <w:r>
+        <w:rPr>
+          <w:rFonts w:ascii="Consolas" w:eastAsia="Consolas" w:hAnsi="Consolas" w:cs="Consolas"/>
+          <w:sz w:val="24"/>
+          <w:szCs w:val="24"/>
+        </w:rPr>
+        <w:t>date » :</w:t>
+      </w:r>
+      <w:r>
+        <w:rPr>
+          <w:rFonts w:ascii="Consolas" w:eastAsia="Consolas" w:hAnsi="Consolas" w:cs="Consolas"/>
+          <w:sz w:val="24"/>
+          <w:szCs w:val="24"/>
+        </w:rPr>
+        <w:t xml:space="preserve"> </w:t>
+      </w:r>
+      <w:proofErr w:type="spellStart"/>
+      <w:r>
+        <w:rPr>
+          <w:rFonts w:ascii="Consolas" w:eastAsia="Consolas" w:hAnsi="Consolas" w:cs="Consolas"/>
+          <w:sz w:val="24"/>
+          <w:szCs w:val="24"/>
+        </w:rPr>
+        <w:t>string|null</w:t>
+      </w:r>
+      <w:proofErr w:type="spellEnd"/>
+      <w:r>
+        <w:rPr>
+          <w:rFonts w:ascii="Consolas" w:eastAsia="Consolas" w:hAnsi="Consolas" w:cs="Consolas"/>
+          <w:sz w:val="24"/>
+          <w:szCs w:val="24"/>
+        </w:rPr>
+        <w:t>,</w:t>
+      </w:r>
+    </w:p>
+    <w:p>
+      <w:pPr>
+        <w:shd w:val="clear" w:color="auto" w:fill="EDF1F8"/>
+        <w:spacing w:after="40" w:line="264" w:lineRule="auto"/>
+        <w:ind w:left="200" w:right="200"/>
+        <w:rPr>
+          <w:sz w:val="24"/>
+          <w:szCs w:val="24"/>
+        </w:rPr>
+      </w:pPr>
+      <w:r>
+        <w:rPr>
+          <w:rFonts w:ascii="Consolas" w:eastAsia="Consolas" w:hAnsi="Consolas" w:cs="Consolas"/>
+          <w:sz w:val="24"/>
+          <w:szCs w:val="24"/>
+        </w:rPr>
+        <w:t xml:space="preserve">  "</w:t>
+      </w:r>
+      <w:r>
+        <w:rPr>
+          <w:rFonts w:ascii="Consolas" w:eastAsia="Consolas" w:hAnsi="Consolas" w:cs="Consolas"/>
+          <w:sz w:val="24"/>
+          <w:szCs w:val="24"/>
+        </w:rPr>
+        <w:t>client » :</w:t>
+      </w:r>
+      <w:r>
+        <w:rPr>
+          <w:rFonts w:ascii="Consolas" w:eastAsia="Consolas" w:hAnsi="Consolas" w:cs="Consolas"/>
+          <w:sz w:val="24"/>
+          <w:szCs w:val="24"/>
+        </w:rPr>
+        <w:t xml:space="preserve"> </w:t>
+      </w:r>
+      <w:proofErr w:type="spellStart"/>
+      <w:r>
+        <w:rPr>
+          <w:rFonts w:ascii="Consolas" w:eastAsia="Consolas" w:hAnsi="Consolas" w:cs="Consolas"/>
+          <w:sz w:val="24"/>
+          <w:szCs w:val="24"/>
+        </w:rPr>
+        <w:t>string|null</w:t>
+      </w:r>
+      <w:proofErr w:type="spellEnd"/>
+      <w:r>
+        <w:rPr>
+          <w:rFonts w:ascii="Consolas" w:eastAsia="Consolas" w:hAnsi="Consolas" w:cs="Consolas"/>
+          <w:sz w:val="24"/>
+          <w:szCs w:val="24"/>
+        </w:rPr>
+        <w:t>,</w:t>
+      </w:r>
+    </w:p>
+    <w:p>
+      <w:pPr>
+        <w:shd w:val="clear" w:color="auto" w:fill="EDF1F8"/>
+        <w:spacing w:after="40" w:line="264" w:lineRule="auto"/>
+        <w:ind w:left="200" w:right="200"/>
+        <w:rPr>
+          <w:sz w:val="24"/>
+          <w:szCs w:val="24"/>
+        </w:rPr>
+      </w:pPr>
+      <w:r>
+        <w:rPr>
+          <w:rFonts w:ascii="Consolas" w:eastAsia="Consolas" w:hAnsi="Consolas" w:cs="Consolas"/>
+          <w:sz w:val="24"/>
+          <w:szCs w:val="24"/>
+        </w:rPr>
+        <w:t xml:space="preserve">  "</w:t>
+      </w:r>
+      <w:proofErr w:type="spellStart"/>
+      <w:r>
+        <w:rPr>
+          <w:rFonts w:ascii="Consolas" w:eastAsia="Consolas" w:hAnsi="Consolas" w:cs="Consolas"/>
+          <w:sz w:val="24"/>
+          <w:szCs w:val="24"/>
+        </w:rPr>
+        <w:t>montant_</w:t>
+      </w:r>
+      <w:r>
+        <w:rPr>
+          <w:rFonts w:ascii="Consolas" w:eastAsia="Consolas" w:hAnsi="Consolas" w:cs="Consolas"/>
+          <w:sz w:val="24"/>
+          <w:szCs w:val="24"/>
+        </w:rPr>
+        <w:t>ht</w:t>
+      </w:r>
+      <w:proofErr w:type="spellEnd"/>
+      <w:r>
+        <w:rPr>
+          <w:rFonts w:ascii="Consolas" w:eastAsia="Consolas" w:hAnsi="Consolas" w:cs="Consolas"/>
+          <w:sz w:val="24"/>
+          <w:szCs w:val="24"/>
+        </w:rPr>
+        <w:t xml:space="preserve"> » :</w:t>
+      </w:r>
+      <w:r>
+        <w:rPr>
+          <w:rFonts w:ascii="Consolas" w:eastAsia="Consolas" w:hAnsi="Consolas" w:cs="Consolas"/>
+          <w:sz w:val="24"/>
+          <w:szCs w:val="24"/>
+        </w:rPr>
+        <w:t xml:space="preserve"> </w:t>
+      </w:r>
+      <w:proofErr w:type="spellStart"/>
+      <w:r>
+        <w:rPr>
+          <w:rFonts w:ascii="Consolas" w:eastAsia="Consolas" w:hAnsi="Consolas" w:cs="Consolas"/>
+          <w:sz w:val="24"/>
+          <w:szCs w:val="24"/>
+        </w:rPr>
+        <w:t>number|null</w:t>
+      </w:r>
+      <w:proofErr w:type="spellEnd"/>
+      <w:r>
+        <w:rPr>
+          <w:rFonts w:ascii="Consolas" w:eastAsia="Consolas" w:hAnsi="Consolas" w:cs="Consolas"/>
+          <w:sz w:val="24"/>
+          <w:szCs w:val="24"/>
+        </w:rPr>
+        <w:t>,</w:t>
+      </w:r>
+    </w:p>
+    <w:p>
+      <w:pPr>
+        <w:shd w:val="clear" w:color="auto" w:fill="EDF1F8"/>
+        <w:spacing w:after="40" w:line="264" w:lineRule="auto"/>
+        <w:ind w:left="200" w:right="200"/>
+        <w:rPr>
+          <w:sz w:val="24"/>
+          <w:szCs w:val="24"/>
+        </w:rPr>
+      </w:pPr>
+      <w:r>
+        <w:rPr>
+          <w:rFonts w:ascii="Consolas" w:eastAsia="Consolas" w:hAnsi="Consolas" w:cs="Consolas"/>
+          <w:sz w:val="24"/>
+          <w:szCs w:val="24"/>
+        </w:rPr>
+        <w:t xml:space="preserve">  "</w:t>
+      </w:r>
+      <w:r>
+        <w:rPr>
+          <w:rFonts w:ascii="Consolas" w:eastAsia="Consolas" w:hAnsi="Consolas" w:cs="Consolas"/>
+          <w:sz w:val="24"/>
+          <w:szCs w:val="24"/>
+        </w:rPr>
+        <w:t>tva » :</w:t>
+      </w:r>
+      <w:r>
+        <w:rPr>
+          <w:rFonts w:ascii="Consolas" w:eastAsia="Consolas" w:hAnsi="Consolas" w:cs="Consolas"/>
+          <w:sz w:val="24"/>
+          <w:szCs w:val="24"/>
+        </w:rPr>
+        <w:t xml:space="preserve"> </w:t>
+      </w:r>
+      <w:proofErr w:type="spellStart"/>
+      <w:r>
+        <w:rPr>
+          <w:rFonts w:ascii="Consolas" w:eastAsia="Consolas" w:hAnsi="Consolas" w:cs="Consolas"/>
+          <w:sz w:val="24"/>
+          <w:szCs w:val="24"/>
+        </w:rPr>
+        <w:t>number|null</w:t>
+      </w:r>
+      <w:proofErr w:type="spellEnd"/>
+      <w:r>
+        <w:rPr>
+          <w:rFonts w:ascii="Consolas" w:eastAsia="Consolas" w:hAnsi="Consolas" w:cs="Consolas"/>
+          <w:sz w:val="24"/>
+          <w:szCs w:val="24"/>
+        </w:rPr>
+        <w:t>,</w:t>
+      </w:r>
+    </w:p>
+    <w:p>
+      <w:pPr>
+        <w:shd w:val="clear" w:color="auto" w:fill="EDF1F8"/>
+        <w:spacing w:after="40" w:line="264" w:lineRule="auto"/>
+        <w:ind w:left="200" w:right="200"/>
+        <w:rPr>
+          <w:rFonts w:ascii="Consolas" w:eastAsia="Consolas" w:hAnsi="Consolas" w:cs="Consolas"/>
+          <w:sz w:val="24"/>
+          <w:szCs w:val="24"/>
+        </w:rPr>
+      </w:pPr>
+      <w:r>
+        <w:rPr>
+          <w:rFonts w:ascii="Consolas" w:eastAsia="Consolas" w:hAnsi="Consolas" w:cs="Consolas"/>
+          <w:sz w:val="24"/>
+          <w:szCs w:val="24"/>
+        </w:rPr>
+        <w:t xml:space="preserve">  "</w:t>
+      </w:r>
+      <w:proofErr w:type="spellStart"/>
+      <w:r>
+        <w:rPr>
+          <w:rFonts w:ascii="Consolas" w:eastAsia="Consolas" w:hAnsi="Consolas" w:cs="Consolas"/>
+          <w:sz w:val="24"/>
+          <w:szCs w:val="24"/>
+        </w:rPr>
+        <w:t>montant_</w:t>
+      </w:r>
+      <w:r>
+        <w:rPr>
+          <w:rFonts w:ascii="Consolas" w:eastAsia="Consolas" w:hAnsi="Consolas" w:cs="Consolas"/>
+          <w:sz w:val="24"/>
+          <w:szCs w:val="24"/>
+        </w:rPr>
+        <w:t>ttc</w:t>
+      </w:r>
+      <w:proofErr w:type="spellEnd"/>
+      <w:r>
+        <w:rPr>
+          <w:rFonts w:ascii="Consolas" w:eastAsia="Consolas" w:hAnsi="Consolas" w:cs="Consolas"/>
+          <w:sz w:val="24"/>
+          <w:szCs w:val="24"/>
+        </w:rPr>
+        <w:t xml:space="preserve"> » :</w:t>
+      </w:r>
+      <w:r>
+        <w:rPr>
+          <w:rFonts w:ascii="Consolas" w:eastAsia="Consolas" w:hAnsi="Consolas" w:cs="Consolas"/>
+          <w:sz w:val="24"/>
+          <w:szCs w:val="24"/>
+        </w:rPr>
+        <w:t xml:space="preserve"> </w:t>
+      </w:r>
+      <w:proofErr w:type="spellStart"/>
+      <w:r>
+        <w:rPr>
+          <w:rFonts w:ascii="Consolas" w:eastAsia="Consolas" w:hAnsi="Consolas" w:cs="Consolas"/>
+          <w:sz w:val="24"/>
+          <w:szCs w:val="24"/>
+        </w:rPr>
+        <w:t>number|null</w:t>
+      </w:r>
+      <w:proofErr w:type="spellEnd"/>
+    </w:p>
+    <w:p>
+      <w:pPr>
+        <w:shd w:val="clear" w:color="auto" w:fill="EDF1F8"/>
+        <w:spacing w:after="40" w:line="264" w:lineRule="auto"/>
+        <w:ind w:left="200" w:right="200"/>
+        <w:rPr>
+          <w:sz w:val="24"/>
+          <w:szCs w:val="24"/>
+        </w:rPr>
+      </w:pPr>
+      <w:r>
+        <w:rPr>
+          <w:rFonts w:ascii="Consolas" w:eastAsia="Consolas" w:hAnsi="Consolas" w:cs="Consolas"/>
+          <w:sz w:val="24"/>
+          <w:szCs w:val="24"/>
+        </w:rPr>
+        <w:t>}</w:t>
+      </w:r>
+    </w:p>
+    <w:p>
+      <w:pPr>
+        <w:rPr>
+          <w:sz w:val="24"/>
+          <w:szCs w:val="24"/>
+        </w:rPr>
+      </w:pPr>
+    </w:p>
+    <w:p>
+      <w:pPr>
+        <w:rPr>
+          <w:sz w:val="24"/>
+          <w:szCs w:val="24"/>
+        </w:rPr>
+      </w:pPr>
+      <w:r>
+        <w:rPr>
+          <w:sz w:val="24"/>
+          <w:szCs w:val="24"/>
+        </w:rPr>
+        <w:drawing>
+          <wp:inline distT="0" distB="0" distL="0" distR="0" wp14:anchorId="4F89AA18" wp14:editId="2AD1E603">
+            <wp:extent cx="4876800" cy="1897607"/>
+            <wp:effectExtent l="0" t="0" r="0" b="7620"/>
+            <wp:docPr id="652596768" name="Image 1"/>
+            <wp:cNvGraphicFramePr>
+              <a:graphicFrameLocks xmlns:a="http://schemas.openxmlformats.org/drawingml/2006/main" noChangeAspect="1"/>
+            </wp:cNvGraphicFramePr>
+            <a:graphic xmlns:a="http://schemas.openxmlformats.org/drawingml/2006/main">
+              <a:graphicData uri="http://schemas.openxmlformats.org/drawingml/2006/picture">
+                <pic:pic xmlns:pic="http://schemas.openxmlformats.org/drawingml/2006/picture">
+                  <pic:nvPicPr>
+                    <pic:cNvPr id="652596768" name=""/>
+                    <pic:cNvPicPr/>
+                  </pic:nvPicPr>
+                  <pic:blipFill rotWithShape="1">
+                    <a:blip r:embed="rId21"/>
+                    <a:srcRect t="-1" b="9580"/>
+                    <a:stretch>
+                      <a:fillRect/>
+                    </a:stretch>
+                  </pic:blipFill>
+                  <pic:spPr bwMode="auto">
+                    <a:xfrm>
+                      <a:off x="0" y="0"/>
+                      <a:ext cx="4914768" cy="1912381"/>
+                    </a:xfrm>
+                    <a:prstGeom prst="rect">
+                      <a:avLst/>
+                    </a:prstGeom>
+                    <a:ln>
+                      <a:noFill/>
+                    </a:ln>
+                    <a:extLst>
+                      <a:ext uri="{53640926-AAD7-44D8-BBD7-CCE9431645EC}">
+                        <a14:shadowObscured xmlns:a14="http://schemas.microsoft.com/office/drawing/2010/main"/>
+                      </a:ext>
+                    </a:extLst>
+                  </pic:spPr>
+                </pic:pic>
+              </a:graphicData>
+            </a:graphic>
+          </wp:inline>
+        </w:drawing>
+      </w:r>
+    </w:p>
+    <w:p>
+      <w:pPr>
+        <w:pStyle w:val="Titre2"/>
+        <w:ind w:firstLine="708"/>
+      </w:pPr>
+      <w:r>
+        <w:lastRenderedPageBreak/>
+        <w:t>5) Email de retard de livraison</w:t>
+      </w:r>
+      <w:r>
+        <w:t> :</w:t>
+      </w:r>
+    </w:p>
+    <w:p>
+      <w:pPr>
+        <w:rPr>
+          <w:sz w:val="24"/>
+          <w:szCs w:val="24"/>
+        </w:rPr>
+      </w:pPr>
+      <w:r>
+        <w:rPr>
+          <w:sz w:val="24"/>
+          <w:szCs w:val="24"/>
+        </w:rPr>
+        <w:t>Créer un prompt permettant de rédiger un email destiné à un client dont la livraison a pris</w:t>
+      </w:r>
+      <w:r>
+        <w:rPr>
+          <w:sz w:val="24"/>
+          <w:szCs w:val="24"/>
+        </w:rPr>
+        <w:t xml:space="preserve"> </w:t>
+      </w:r>
+      <w:r>
+        <w:rPr>
+          <w:sz w:val="24"/>
+          <w:szCs w:val="24"/>
+        </w:rPr>
+        <w:t>du retard avec les objectifs (reconnaître le retard, présenter des excuses, expliquer la</w:t>
+      </w:r>
+      <w:r>
+        <w:rPr>
+          <w:sz w:val="24"/>
+          <w:szCs w:val="24"/>
+        </w:rPr>
+        <w:t xml:space="preserve"> </w:t>
+      </w:r>
+      <w:r>
+        <w:rPr>
+          <w:sz w:val="24"/>
+          <w:szCs w:val="24"/>
+        </w:rPr>
+        <w:t>situation sans inventer de cause et proposer une solution), le ton (professionnel, courtois et</w:t>
+      </w:r>
+      <w:r>
+        <w:rPr>
+          <w:sz w:val="24"/>
+          <w:szCs w:val="24"/>
+        </w:rPr>
+        <w:t xml:space="preserve"> </w:t>
+      </w:r>
+      <w:r>
+        <w:rPr>
+          <w:sz w:val="24"/>
+          <w:szCs w:val="24"/>
+        </w:rPr>
+        <w:t>rassurant) et la longueur maximale (150 mots)</w:t>
+      </w:r>
+    </w:p>
+    <w:p>
+      <w:pPr>
+        <w:rPr>
+          <w:sz w:val="24"/>
+          <w:szCs w:val="24"/>
+        </w:rPr>
+      </w:pPr>
+    </w:p>
+    <w:p>
+      <w:pPr>
+        <w:shd w:val="clear" w:color="auto" w:fill="2E5090"/>
+        <w:spacing w:before="120"/>
+        <w:rPr>
+          <w:sz w:val="24"/>
+          <w:szCs w:val="24"/>
+        </w:rPr>
+      </w:pPr>
+      <w:r>
+        <w:rPr>
+          <w:b/>
+          <w:bCs/>
+          <w:color w:val="FFFFFF"/>
+          <w:sz w:val="24"/>
+          <w:szCs w:val="24"/>
+        </w:rPr>
+        <w:t xml:space="preserve">  PROMPT</w:t>
+      </w:r>
+    </w:p>
+    <w:p>
+      <w:pPr>
+        <w:shd w:val="clear" w:color="auto" w:fill="EDF1F8"/>
+        <w:spacing w:after="40" w:line="264" w:lineRule="auto"/>
+        <w:ind w:left="200" w:right="200"/>
+        <w:rPr>
+          <w:sz w:val="24"/>
+          <w:szCs w:val="24"/>
+        </w:rPr>
+      </w:pPr>
+      <w:r>
+        <w:rPr>
+          <w:rFonts w:ascii="Consolas" w:eastAsia="Consolas" w:hAnsi="Consolas" w:cs="Consolas"/>
+          <w:sz w:val="24"/>
+          <w:szCs w:val="24"/>
+        </w:rPr>
+        <w:t>Rédige un email destiné à un client dont la commande a pris du retard.</w:t>
+      </w:r>
+    </w:p>
+    <w:p>
+      <w:pPr>
+        <w:shd w:val="clear" w:color="auto" w:fill="EDF1F8"/>
+        <w:spacing w:after="40" w:line="264" w:lineRule="auto"/>
+        <w:ind w:left="200" w:right="200"/>
+        <w:rPr>
+          <w:sz w:val="24"/>
+          <w:szCs w:val="24"/>
+        </w:rPr>
+      </w:pPr>
+    </w:p>
+    <w:p>
+      <w:pPr>
+        <w:shd w:val="clear" w:color="auto" w:fill="EDF1F8"/>
+        <w:spacing w:after="40" w:line="264" w:lineRule="auto"/>
+        <w:ind w:left="200" w:right="200"/>
+        <w:rPr>
+          <w:sz w:val="24"/>
+          <w:szCs w:val="24"/>
+        </w:rPr>
+      </w:pPr>
+      <w:r>
+        <w:rPr>
+          <w:rFonts w:ascii="Consolas" w:eastAsia="Consolas" w:hAnsi="Consolas" w:cs="Consolas"/>
+          <w:sz w:val="24"/>
+          <w:szCs w:val="24"/>
+        </w:rPr>
+        <w:t>Objectifs :</w:t>
+      </w:r>
+    </w:p>
+    <w:p>
+      <w:pPr>
+        <w:shd w:val="clear" w:color="auto" w:fill="EDF1F8"/>
+        <w:spacing w:after="40" w:line="264" w:lineRule="auto"/>
+        <w:ind w:left="200" w:right="200"/>
+        <w:rPr>
+          <w:sz w:val="24"/>
+          <w:szCs w:val="24"/>
+        </w:rPr>
+      </w:pPr>
+      <w:r>
+        <w:rPr>
+          <w:rFonts w:ascii="Consolas" w:eastAsia="Consolas" w:hAnsi="Consolas" w:cs="Consolas"/>
+          <w:sz w:val="24"/>
+          <w:szCs w:val="24"/>
+        </w:rPr>
+        <w:t>- Reconnaître clairement le retard.</w:t>
+      </w:r>
+    </w:p>
+    <w:p>
+      <w:pPr>
+        <w:shd w:val="clear" w:color="auto" w:fill="EDF1F8"/>
+        <w:spacing w:after="40" w:line="264" w:lineRule="auto"/>
+        <w:ind w:left="200" w:right="200"/>
+        <w:rPr>
+          <w:sz w:val="24"/>
+          <w:szCs w:val="24"/>
+        </w:rPr>
+      </w:pPr>
+      <w:r>
+        <w:rPr>
+          <w:rFonts w:ascii="Consolas" w:eastAsia="Consolas" w:hAnsi="Consolas" w:cs="Consolas"/>
+          <w:sz w:val="24"/>
+          <w:szCs w:val="24"/>
+        </w:rPr>
+        <w:t>- Présenter des excuses sincères.</w:t>
+      </w:r>
+    </w:p>
+    <w:p>
+      <w:pPr>
+        <w:shd w:val="clear" w:color="auto" w:fill="EDF1F8"/>
+        <w:spacing w:after="40" w:line="264" w:lineRule="auto"/>
+        <w:ind w:left="200" w:right="200"/>
+        <w:rPr>
+          <w:sz w:val="24"/>
+          <w:szCs w:val="24"/>
+        </w:rPr>
+      </w:pPr>
+      <w:r>
+        <w:rPr>
+          <w:rFonts w:ascii="Consolas" w:eastAsia="Consolas" w:hAnsi="Consolas" w:cs="Consolas"/>
+          <w:sz w:val="24"/>
+          <w:szCs w:val="24"/>
+        </w:rPr>
+        <w:t>- Expliquer la situation sans inventer de cause si elle n'est pas fournie</w:t>
+      </w:r>
+      <w:r>
+        <w:rPr>
+          <w:sz w:val="24"/>
+          <w:szCs w:val="24"/>
+        </w:rPr>
+        <w:t xml:space="preserve"> </w:t>
+      </w:r>
+      <w:r>
+        <w:rPr>
+          <w:rFonts w:ascii="Consolas" w:eastAsia="Consolas" w:hAnsi="Consolas" w:cs="Consolas"/>
+          <w:sz w:val="24"/>
+          <w:szCs w:val="24"/>
+        </w:rPr>
+        <w:t>(rester général si besoin, ex. "un contretemps logistique").</w:t>
+      </w:r>
+    </w:p>
+    <w:p>
+      <w:pPr>
+        <w:shd w:val="clear" w:color="auto" w:fill="EDF1F8"/>
+        <w:spacing w:after="40" w:line="264" w:lineRule="auto"/>
+        <w:ind w:left="200" w:right="200"/>
+        <w:rPr>
+          <w:sz w:val="24"/>
+          <w:szCs w:val="24"/>
+        </w:rPr>
+      </w:pPr>
+      <w:r>
+        <w:rPr>
+          <w:rFonts w:ascii="Consolas" w:eastAsia="Consolas" w:hAnsi="Consolas" w:cs="Consolas"/>
+          <w:sz w:val="24"/>
+          <w:szCs w:val="24"/>
+        </w:rPr>
+        <w:t>- Proposer une solution concrète (nouveau délai, geste commercial, etc.).</w:t>
+      </w:r>
+    </w:p>
+    <w:p>
+      <w:pPr>
+        <w:shd w:val="clear" w:color="auto" w:fill="EDF1F8"/>
+        <w:spacing w:after="40" w:line="264" w:lineRule="auto"/>
+        <w:ind w:left="200" w:right="200"/>
+        <w:rPr>
+          <w:sz w:val="24"/>
+          <w:szCs w:val="24"/>
+        </w:rPr>
+      </w:pPr>
+    </w:p>
+    <w:p>
+      <w:pPr>
+        <w:shd w:val="clear" w:color="auto" w:fill="EDF1F8"/>
+        <w:spacing w:after="40" w:line="264" w:lineRule="auto"/>
+        <w:ind w:left="200" w:right="200"/>
+        <w:rPr>
+          <w:sz w:val="24"/>
+          <w:szCs w:val="24"/>
+        </w:rPr>
+      </w:pPr>
+      <w:r>
+        <w:rPr>
+          <w:rFonts w:ascii="Consolas" w:eastAsia="Consolas" w:hAnsi="Consolas" w:cs="Consolas"/>
+          <w:sz w:val="24"/>
+          <w:szCs w:val="24"/>
+        </w:rPr>
+        <w:t>Ton : professionnel, courtois et rassurant.</w:t>
+      </w:r>
+    </w:p>
+    <w:p>
+      <w:pPr>
+        <w:shd w:val="clear" w:color="auto" w:fill="EDF1F8"/>
+        <w:spacing w:after="40" w:line="264" w:lineRule="auto"/>
+        <w:ind w:left="200" w:right="200"/>
+        <w:rPr>
+          <w:sz w:val="24"/>
+          <w:szCs w:val="24"/>
+        </w:rPr>
+      </w:pPr>
+      <w:r>
+        <w:rPr>
+          <w:rFonts w:ascii="Consolas" w:eastAsia="Consolas" w:hAnsi="Consolas" w:cs="Consolas"/>
+          <w:sz w:val="24"/>
+          <w:szCs w:val="24"/>
+        </w:rPr>
+        <w:t>Longueur maximale : 150 mots.</w:t>
+      </w:r>
+    </w:p>
+    <w:p>
+      <w:pPr>
+        <w:shd w:val="clear" w:color="auto" w:fill="EDF1F8"/>
+        <w:spacing w:after="40" w:line="264" w:lineRule="auto"/>
+        <w:ind w:left="200" w:right="200"/>
+        <w:rPr>
+          <w:sz w:val="24"/>
+          <w:szCs w:val="24"/>
+        </w:rPr>
+      </w:pPr>
+    </w:p>
+    <w:p>
+      <w:pPr>
+        <w:shd w:val="clear" w:color="auto" w:fill="EDF1F8"/>
+        <w:spacing w:line="264" w:lineRule="auto"/>
+        <w:ind w:left="200" w:right="200"/>
+        <w:rPr>
+          <w:sz w:val="24"/>
+          <w:szCs w:val="24"/>
+        </w:rPr>
+      </w:pPr>
+      <w:r>
+        <w:rPr>
+          <w:rFonts w:ascii="Consolas" w:eastAsia="Consolas" w:hAnsi="Consolas" w:cs="Consolas"/>
+          <w:sz w:val="24"/>
+          <w:szCs w:val="24"/>
+        </w:rPr>
+        <w:t>Informations disponibles : {</w:t>
+      </w:r>
+      <w:proofErr w:type="spellStart"/>
+      <w:r>
+        <w:rPr>
+          <w:rFonts w:ascii="Consolas" w:eastAsia="Consolas" w:hAnsi="Consolas" w:cs="Consolas"/>
+          <w:sz w:val="24"/>
+          <w:szCs w:val="24"/>
+        </w:rPr>
+        <w:t>infos_commande_et_retard</w:t>
+      </w:r>
+      <w:proofErr w:type="spellEnd"/>
+      <w:r>
+        <w:rPr>
+          <w:rFonts w:ascii="Consolas" w:eastAsia="Consolas" w:hAnsi="Consolas" w:cs="Consolas"/>
+          <w:sz w:val="24"/>
+          <w:szCs w:val="24"/>
+        </w:rPr>
+        <w:t>}</w:t>
+      </w:r>
+    </w:p>
+    <w:p/>
+    <w:p>
+      <w:r>
+        <w:drawing>
+          <wp:inline distT="0" distB="0" distL="0" distR="0" wp14:anchorId="494D51BB" wp14:editId="49D78D6D">
+            <wp:extent cx="5760720" cy="2360295"/>
+            <wp:effectExtent l="0" t="0" r="0" b="1905"/>
+            <wp:docPr id="694284795" name="Image 1"/>
+            <wp:cNvGraphicFramePr>
+              <a:graphicFrameLocks xmlns:a="http://schemas.openxmlformats.org/drawingml/2006/main" noChangeAspect="1"/>
+            </wp:cNvGraphicFramePr>
+            <a:graphic xmlns:a="http://schemas.openxmlformats.org/drawingml/2006/main">
+              <a:graphicData uri="http://schemas.openxmlformats.org/drawingml/2006/picture">
+                <pic:pic xmlns:pic="http://schemas.openxmlformats.org/drawingml/2006/picture">
+                  <pic:nvPicPr>
+                    <pic:cNvPr id="694284795" name=""/>
+                    <pic:cNvPicPr/>
+                  </pic:nvPicPr>
+                  <pic:blipFill>
+                    <a:blip r:embed="rId22"/>
+                    <a:stretch>
+                      <a:fillRect/>
+                    </a:stretch>
+                  </pic:blipFill>
+                  <pic:spPr>
+                    <a:xfrm>
+                      <a:off x="0" y="0"/>
+                      <a:ext cx="5760720" cy="2360295"/>
                     </a:xfrm>
                     <a:prstGeom prst="rect">
                       <a:avLst/>

</xml_diff>

<commit_message>
Partie 7 – Prompt Engineering et RAG
</commit_message>
<xml_diff>
--- a/ai-business_assistant/Atelier Prompt Engineering.docx
+++ b/ai-business_assistant/Atelier Prompt Engineering.docx
@@ -19519,6 +19519,1348 @@
         </w:rPr>
       </w:pPr>
     </w:p>
+    <w:p>
+      <w:pPr>
+        <w:pStyle w:val="Titre1"/>
+        <w:pBdr>
+          <w:bottom w:val="single" w:sz="6" w:space="4" w:color="2E5090"/>
+        </w:pBdr>
+      </w:pPr>
+      <w:r>
+        <w:t>Partie 7</w:t>
+      </w:r>
+      <w:r>
+        <w:t> :</w:t>
+      </w:r>
+      <w:r>
+        <w:t xml:space="preserve">  Prompt Engineering et RAG</w:t>
+      </w:r>
+      <w:r>
+        <w:t> :</w:t>
+      </w:r>
+    </w:p>
+    <w:p/>
+    <w:p>
+      <w:pPr>
+        <w:spacing w:after="160" w:line="288" w:lineRule="auto"/>
+        <w:rPr>
+          <w:sz w:val="24"/>
+          <w:szCs w:val="24"/>
+        </w:rPr>
+      </w:pPr>
+      <w:r>
+        <w:rPr>
+          <w:sz w:val="24"/>
+          <w:szCs w:val="24"/>
+        </w:rPr>
+        <w:t xml:space="preserve">Le principe testé ici est celui du </w:t>
+      </w:r>
+      <w:proofErr w:type="spellStart"/>
+      <w:r>
+        <w:rPr>
+          <w:sz w:val="24"/>
+          <w:szCs w:val="24"/>
+        </w:rPr>
+        <w:t>Retrieval-Augmented</w:t>
+      </w:r>
+      <w:proofErr w:type="spellEnd"/>
+      <w:r>
+        <w:rPr>
+          <w:sz w:val="24"/>
+          <w:szCs w:val="24"/>
+        </w:rPr>
+        <w:t xml:space="preserve"> </w:t>
+      </w:r>
+      <w:proofErr w:type="spellStart"/>
+      <w:r>
+        <w:rPr>
+          <w:sz w:val="24"/>
+          <w:szCs w:val="24"/>
+        </w:rPr>
+        <w:t>Generation</w:t>
+      </w:r>
+      <w:proofErr w:type="spellEnd"/>
+      <w:r>
+        <w:rPr>
+          <w:sz w:val="24"/>
+          <w:szCs w:val="24"/>
+        </w:rPr>
+        <w:t xml:space="preserve"> : comparer la réponse du modèle selon qu'il dispose ou non du document source, et selon que des garde-fous anti-hallucination sont imposés.</w:t>
+      </w:r>
+    </w:p>
+    <w:p>
+      <w:pPr>
+        <w:pStyle w:val="Titre2"/>
+        <w:ind w:left="708"/>
+      </w:pPr>
+      <w:r>
+        <w:t>2) Tester trois prompts pour poser une question relative à un contenu du document</w:t>
+      </w:r>
+      <w:r>
+        <w:rPr>
+          <w:sz w:val="24"/>
+          <w:szCs w:val="24"/>
+        </w:rPr>
+        <w:t> :</w:t>
+      </w:r>
+    </w:p>
+    <w:p>
+      <w:pPr>
+        <w:pStyle w:val="Titre2"/>
+      </w:pPr>
+      <w:r>
+        <w:t>Prompt A — sans document</w:t>
+      </w:r>
+      <w:r>
+        <w:t> :</w:t>
+      </w:r>
+    </w:p>
+    <w:p>
+      <w:pPr>
+        <w:shd w:val="clear" w:color="auto" w:fill="2E5090"/>
+        <w:spacing w:before="120"/>
+        <w:rPr>
+          <w:sz w:val="24"/>
+          <w:szCs w:val="24"/>
+        </w:rPr>
+      </w:pPr>
+      <w:r>
+        <w:rPr>
+          <w:b/>
+          <w:bCs/>
+          <w:color w:val="FFFFFF"/>
+          <w:sz w:val="24"/>
+          <w:szCs w:val="24"/>
+        </w:rPr>
+        <w:t xml:space="preserve">  PROMPT</w:t>
+      </w:r>
+    </w:p>
+    <w:p>
+      <w:pPr>
+        <w:shd w:val="clear" w:color="auto" w:fill="EDF1F8"/>
+        <w:spacing w:line="264" w:lineRule="auto"/>
+        <w:ind w:left="200" w:right="200"/>
+        <w:rPr>
+          <w:sz w:val="24"/>
+          <w:szCs w:val="24"/>
+        </w:rPr>
+      </w:pPr>
+      <w:r>
+        <w:rPr>
+          <w:rFonts w:ascii="Consolas" w:eastAsia="Consolas" w:hAnsi="Consolas" w:cs="Consolas"/>
+          <w:sz w:val="24"/>
+          <w:szCs w:val="24"/>
+        </w:rPr>
+        <w:t>Réponds à la question suivante : {question}</w:t>
+      </w:r>
+    </w:p>
+    <w:p/>
+    <w:p/>
+    <w:p/>
+    <w:p>
+      <w:r>
+        <w:drawing>
+          <wp:inline distT="0" distB="0" distL="0" distR="0" wp14:anchorId="1A18EDF2" wp14:editId="193E989A">
+            <wp:extent cx="5760720" cy="2329815"/>
+            <wp:effectExtent l="0" t="0" r="0" b="0"/>
+            <wp:docPr id="1822776526" name="Image 1"/>
+            <wp:cNvGraphicFramePr>
+              <a:graphicFrameLocks xmlns:a="http://schemas.openxmlformats.org/drawingml/2006/main" noChangeAspect="1"/>
+            </wp:cNvGraphicFramePr>
+            <a:graphic xmlns:a="http://schemas.openxmlformats.org/drawingml/2006/main">
+              <a:graphicData uri="http://schemas.openxmlformats.org/drawingml/2006/picture">
+                <pic:pic xmlns:pic="http://schemas.openxmlformats.org/drawingml/2006/picture">
+                  <pic:nvPicPr>
+                    <pic:cNvPr id="1822776526" name=""/>
+                    <pic:cNvPicPr/>
+                  </pic:nvPicPr>
+                  <pic:blipFill>
+                    <a:blip r:embed="rId31"/>
+                    <a:stretch>
+                      <a:fillRect/>
+                    </a:stretch>
+                  </pic:blipFill>
+                  <pic:spPr>
+                    <a:xfrm>
+                      <a:off x="0" y="0"/>
+                      <a:ext cx="5760720" cy="2329815"/>
+                    </a:xfrm>
+                    <a:prstGeom prst="rect">
+                      <a:avLst/>
+                    </a:prstGeom>
+                  </pic:spPr>
+                </pic:pic>
+              </a:graphicData>
+            </a:graphic>
+          </wp:inline>
+        </w:drawing>
+      </w:r>
+    </w:p>
+    <w:p>
+      <w:pPr>
+        <w:autoSpaceDE w:val="0"/>
+        <w:autoSpaceDN w:val="0"/>
+        <w:adjustRightInd w:val="0"/>
+        <w:rPr>
+          <w:rFonts w:ascii="CIDFont+F1" w:eastAsiaTheme="minorHAnsi" w:hAnsi="CIDFont+F1" w:cs="CIDFont+F1"/>
+          <w:color w:val="auto"/>
+          <w:sz w:val="24"/>
+          <w:szCs w:val="24"/>
+          <w:lang w:eastAsia="en-US"/>
+          <w14:ligatures w14:val="standardContextual"/>
+        </w:rPr>
+      </w:pPr>
+    </w:p>
+    <w:p>
+      <w:pPr>
+        <w:autoSpaceDE w:val="0"/>
+        <w:autoSpaceDN w:val="0"/>
+        <w:adjustRightInd w:val="0"/>
+        <w:rPr>
+          <w:rFonts w:ascii="CIDFont+F1" w:eastAsiaTheme="minorHAnsi" w:hAnsi="CIDFont+F1" w:cs="CIDFont+F1"/>
+          <w:color w:val="auto"/>
+          <w:sz w:val="24"/>
+          <w:szCs w:val="24"/>
+          <w:lang w:eastAsia="en-US"/>
+          <w14:ligatures w14:val="standardContextual"/>
+        </w:rPr>
+      </w:pPr>
+    </w:p>
+    <w:p>
+      <w:pPr>
+        <w:pStyle w:val="Titre2"/>
+      </w:pPr>
+      <w:r>
+        <w:t>Prompt B — avec document, sans contrainte</w:t>
+      </w:r>
+      <w:r>
+        <w:t> :</w:t>
+      </w:r>
+    </w:p>
+    <w:p/>
+    <w:p>
+      <w:pPr>
+        <w:shd w:val="clear" w:color="auto" w:fill="2E5090"/>
+        <w:spacing w:before="120"/>
+        <w:rPr>
+          <w:sz w:val="24"/>
+          <w:szCs w:val="24"/>
+        </w:rPr>
+      </w:pPr>
+      <w:r>
+        <w:rPr>
+          <w:b/>
+          <w:bCs/>
+          <w:color w:val="FFFFFF"/>
+          <w:sz w:val="24"/>
+          <w:szCs w:val="24"/>
+        </w:rPr>
+        <w:t xml:space="preserve">  PROMPT</w:t>
+      </w:r>
+    </w:p>
+    <w:p>
+      <w:pPr>
+        <w:shd w:val="clear" w:color="auto" w:fill="EDF1F8"/>
+        <w:spacing w:after="40" w:line="264" w:lineRule="auto"/>
+        <w:ind w:left="200" w:right="200"/>
+        <w:rPr>
+          <w:sz w:val="24"/>
+          <w:szCs w:val="24"/>
+        </w:rPr>
+      </w:pPr>
+      <w:r>
+        <w:rPr>
+          <w:rFonts w:ascii="Consolas" w:eastAsia="Consolas" w:hAnsi="Consolas" w:cs="Consolas"/>
+          <w:sz w:val="24"/>
+          <w:szCs w:val="24"/>
+        </w:rPr>
+        <w:t>Voici un document :</w:t>
+      </w:r>
+    </w:p>
+    <w:p>
+      <w:pPr>
+        <w:shd w:val="clear" w:color="auto" w:fill="EDF1F8"/>
+        <w:spacing w:after="40" w:line="264" w:lineRule="auto"/>
+        <w:ind w:left="200" w:right="200"/>
+        <w:rPr>
+          <w:sz w:val="24"/>
+          <w:szCs w:val="24"/>
+        </w:rPr>
+      </w:pPr>
+      <w:r>
+        <w:rPr>
+          <w:rFonts w:ascii="Consolas" w:eastAsia="Consolas" w:hAnsi="Consolas" w:cs="Consolas"/>
+          <w:sz w:val="24"/>
+          <w:szCs w:val="24"/>
+        </w:rPr>
+        <w:t>"""</w:t>
+      </w:r>
+    </w:p>
+    <w:p>
+      <w:pPr>
+        <w:shd w:val="clear" w:color="auto" w:fill="EDF1F8"/>
+        <w:spacing w:after="40" w:line="264" w:lineRule="auto"/>
+        <w:ind w:left="200" w:right="200"/>
+        <w:rPr>
+          <w:sz w:val="24"/>
+          <w:szCs w:val="24"/>
+        </w:rPr>
+      </w:pPr>
+      <w:r>
+        <w:rPr>
+          <w:rFonts w:ascii="Consolas" w:eastAsia="Consolas" w:hAnsi="Consolas" w:cs="Consolas"/>
+          <w:sz w:val="24"/>
+          <w:szCs w:val="24"/>
+        </w:rPr>
+        <w:t>{</w:t>
+      </w:r>
+      <w:proofErr w:type="gramStart"/>
+      <w:r>
+        <w:rPr>
+          <w:rFonts w:ascii="Consolas" w:eastAsia="Consolas" w:hAnsi="Consolas" w:cs="Consolas"/>
+          <w:sz w:val="24"/>
+          <w:szCs w:val="24"/>
+        </w:rPr>
+        <w:t>document</w:t>
+      </w:r>
+      <w:proofErr w:type="gramEnd"/>
+      <w:r>
+        <w:rPr>
+          <w:rFonts w:ascii="Consolas" w:eastAsia="Consolas" w:hAnsi="Consolas" w:cs="Consolas"/>
+          <w:sz w:val="24"/>
+          <w:szCs w:val="24"/>
+        </w:rPr>
+        <w:t>}</w:t>
+      </w:r>
+    </w:p>
+    <w:p>
+      <w:pPr>
+        <w:shd w:val="clear" w:color="auto" w:fill="EDF1F8"/>
+        <w:spacing w:after="40" w:line="264" w:lineRule="auto"/>
+        <w:ind w:left="200" w:right="200"/>
+        <w:rPr>
+          <w:sz w:val="24"/>
+          <w:szCs w:val="24"/>
+        </w:rPr>
+      </w:pPr>
+      <w:r>
+        <w:rPr>
+          <w:rFonts w:ascii="Consolas" w:eastAsia="Consolas" w:hAnsi="Consolas" w:cs="Consolas"/>
+          <w:sz w:val="24"/>
+          <w:szCs w:val="24"/>
+        </w:rPr>
+        <w:lastRenderedPageBreak/>
+        <w:t>"""</w:t>
+      </w:r>
+    </w:p>
+    <w:p>
+      <w:pPr>
+        <w:shd w:val="clear" w:color="auto" w:fill="EDF1F8"/>
+        <w:spacing w:after="40" w:line="264" w:lineRule="auto"/>
+        <w:ind w:left="200" w:right="200"/>
+        <w:rPr>
+          <w:sz w:val="24"/>
+          <w:szCs w:val="24"/>
+        </w:rPr>
+      </w:pPr>
+    </w:p>
+    <w:p>
+      <w:pPr>
+        <w:shd w:val="clear" w:color="auto" w:fill="EDF1F8"/>
+        <w:spacing w:line="264" w:lineRule="auto"/>
+        <w:ind w:left="200" w:right="200"/>
+        <w:rPr>
+          <w:sz w:val="24"/>
+          <w:szCs w:val="24"/>
+        </w:rPr>
+      </w:pPr>
+      <w:r>
+        <w:rPr>
+          <w:rFonts w:ascii="Consolas" w:eastAsia="Consolas" w:hAnsi="Consolas" w:cs="Consolas"/>
+          <w:sz w:val="24"/>
+          <w:szCs w:val="24"/>
+        </w:rPr>
+        <w:t>Réponds à la question suivante : {question}</w:t>
+      </w:r>
+    </w:p>
+    <w:p/>
+    <w:p>
+      <w:r>
+        <w:drawing>
+          <wp:inline distT="0" distB="0" distL="0" distR="0" wp14:anchorId="4AB9D528" wp14:editId="67DB6E36">
+            <wp:extent cx="5760720" cy="2301240"/>
+            <wp:effectExtent l="0" t="0" r="0" b="3810"/>
+            <wp:docPr id="1903323732" name="Image 1"/>
+            <wp:cNvGraphicFramePr>
+              <a:graphicFrameLocks xmlns:a="http://schemas.openxmlformats.org/drawingml/2006/main" noChangeAspect="1"/>
+            </wp:cNvGraphicFramePr>
+            <a:graphic xmlns:a="http://schemas.openxmlformats.org/drawingml/2006/main">
+              <a:graphicData uri="http://schemas.openxmlformats.org/drawingml/2006/picture">
+                <pic:pic xmlns:pic="http://schemas.openxmlformats.org/drawingml/2006/picture">
+                  <pic:nvPicPr>
+                    <pic:cNvPr id="1903323732" name=""/>
+                    <pic:cNvPicPr/>
+                  </pic:nvPicPr>
+                  <pic:blipFill>
+                    <a:blip r:embed="rId32"/>
+                    <a:stretch>
+                      <a:fillRect/>
+                    </a:stretch>
+                  </pic:blipFill>
+                  <pic:spPr>
+                    <a:xfrm>
+                      <a:off x="0" y="0"/>
+                      <a:ext cx="5760720" cy="2301240"/>
+                    </a:xfrm>
+                    <a:prstGeom prst="rect">
+                      <a:avLst/>
+                    </a:prstGeom>
+                  </pic:spPr>
+                </pic:pic>
+              </a:graphicData>
+            </a:graphic>
+          </wp:inline>
+        </w:drawing>
+      </w:r>
+    </w:p>
+    <w:p/>
+    <w:p>
+      <w:pPr>
+        <w:pStyle w:val="Titre2"/>
+      </w:pPr>
+      <w:r>
+        <w:t>Prompt C — avec document et contraintes RAG</w:t>
+      </w:r>
+      <w:r>
+        <w:t> :</w:t>
+      </w:r>
+    </w:p>
+    <w:p>
+      <w:pPr>
+        <w:shd w:val="clear" w:color="auto" w:fill="2E5090"/>
+        <w:spacing w:before="120"/>
+        <w:rPr>
+          <w:sz w:val="24"/>
+          <w:szCs w:val="24"/>
+        </w:rPr>
+      </w:pPr>
+      <w:r>
+        <w:rPr>
+          <w:b/>
+          <w:bCs/>
+          <w:color w:val="FFFFFF"/>
+          <w:sz w:val="24"/>
+          <w:szCs w:val="24"/>
+        </w:rPr>
+        <w:t xml:space="preserve">  PROMPT</w:t>
+      </w:r>
+    </w:p>
+    <w:p>
+      <w:pPr>
+        <w:shd w:val="clear" w:color="auto" w:fill="EDF1F8"/>
+        <w:spacing w:after="40" w:line="264" w:lineRule="auto"/>
+        <w:ind w:left="200" w:right="200"/>
+        <w:rPr>
+          <w:sz w:val="24"/>
+          <w:szCs w:val="24"/>
+        </w:rPr>
+      </w:pPr>
+      <w:r>
+        <w:rPr>
+          <w:rFonts w:ascii="Consolas" w:eastAsia="Consolas" w:hAnsi="Consolas" w:cs="Consolas"/>
+          <w:sz w:val="24"/>
+          <w:szCs w:val="24"/>
+        </w:rPr>
+        <w:t>Voici un document :</w:t>
+      </w:r>
+    </w:p>
+    <w:p>
+      <w:pPr>
+        <w:shd w:val="clear" w:color="auto" w:fill="EDF1F8"/>
+        <w:spacing w:after="40" w:line="264" w:lineRule="auto"/>
+        <w:ind w:left="200" w:right="200"/>
+        <w:rPr>
+          <w:sz w:val="24"/>
+          <w:szCs w:val="24"/>
+        </w:rPr>
+      </w:pPr>
+      <w:r>
+        <w:rPr>
+          <w:rFonts w:ascii="Consolas" w:eastAsia="Consolas" w:hAnsi="Consolas" w:cs="Consolas"/>
+          <w:sz w:val="24"/>
+          <w:szCs w:val="24"/>
+        </w:rPr>
+        <w:t>"""</w:t>
+      </w:r>
+    </w:p>
+    <w:p>
+      <w:pPr>
+        <w:shd w:val="clear" w:color="auto" w:fill="EDF1F8"/>
+        <w:spacing w:after="40" w:line="264" w:lineRule="auto"/>
+        <w:ind w:left="200" w:right="200"/>
+        <w:rPr>
+          <w:sz w:val="24"/>
+          <w:szCs w:val="24"/>
+        </w:rPr>
+      </w:pPr>
+      <w:r>
+        <w:rPr>
+          <w:rFonts w:ascii="Consolas" w:eastAsia="Consolas" w:hAnsi="Consolas" w:cs="Consolas"/>
+          <w:sz w:val="24"/>
+          <w:szCs w:val="24"/>
+        </w:rPr>
+        <w:t>{</w:t>
+      </w:r>
+      <w:proofErr w:type="gramStart"/>
+      <w:r>
+        <w:rPr>
+          <w:rFonts w:ascii="Consolas" w:eastAsia="Consolas" w:hAnsi="Consolas" w:cs="Consolas"/>
+          <w:sz w:val="24"/>
+          <w:szCs w:val="24"/>
+        </w:rPr>
+        <w:t>document</w:t>
+      </w:r>
+      <w:proofErr w:type="gramEnd"/>
+      <w:r>
+        <w:rPr>
+          <w:rFonts w:ascii="Consolas" w:eastAsia="Consolas" w:hAnsi="Consolas" w:cs="Consolas"/>
+          <w:sz w:val="24"/>
+          <w:szCs w:val="24"/>
+        </w:rPr>
+        <w:t>}</w:t>
+      </w:r>
+    </w:p>
+    <w:p>
+      <w:pPr>
+        <w:shd w:val="clear" w:color="auto" w:fill="EDF1F8"/>
+        <w:spacing w:after="40" w:line="264" w:lineRule="auto"/>
+        <w:ind w:left="200" w:right="200"/>
+        <w:rPr>
+          <w:sz w:val="24"/>
+          <w:szCs w:val="24"/>
+        </w:rPr>
+      </w:pPr>
+      <w:r>
+        <w:rPr>
+          <w:rFonts w:ascii="Consolas" w:eastAsia="Consolas" w:hAnsi="Consolas" w:cs="Consolas"/>
+          <w:sz w:val="24"/>
+          <w:szCs w:val="24"/>
+        </w:rPr>
+        <w:t>"""</w:t>
+      </w:r>
+    </w:p>
+    <w:p>
+      <w:pPr>
+        <w:shd w:val="clear" w:color="auto" w:fill="EDF1F8"/>
+        <w:spacing w:after="40" w:line="264" w:lineRule="auto"/>
+        <w:ind w:left="200" w:right="200"/>
+        <w:rPr>
+          <w:sz w:val="24"/>
+          <w:szCs w:val="24"/>
+        </w:rPr>
+      </w:pPr>
+    </w:p>
+    <w:p>
+      <w:pPr>
+        <w:shd w:val="clear" w:color="auto" w:fill="EDF1F8"/>
+        <w:spacing w:after="40" w:line="264" w:lineRule="auto"/>
+        <w:ind w:left="200" w:right="200"/>
+        <w:rPr>
+          <w:sz w:val="24"/>
+          <w:szCs w:val="24"/>
+        </w:rPr>
+      </w:pPr>
+      <w:r>
+        <w:rPr>
+          <w:rFonts w:ascii="Consolas" w:eastAsia="Consolas" w:hAnsi="Consolas" w:cs="Consolas"/>
+          <w:sz w:val="24"/>
+          <w:szCs w:val="24"/>
+        </w:rPr>
+        <w:t>Réponds à la question suivante en utilisant UNIQUEMENT les informations</w:t>
+      </w:r>
+      <w:r>
+        <w:rPr>
+          <w:sz w:val="24"/>
+          <w:szCs w:val="24"/>
+        </w:rPr>
+        <w:t xml:space="preserve"> </w:t>
+      </w:r>
+      <w:r>
+        <w:rPr>
+          <w:rFonts w:ascii="Consolas" w:eastAsia="Consolas" w:hAnsi="Consolas" w:cs="Consolas"/>
+          <w:sz w:val="24"/>
+          <w:szCs w:val="24"/>
+        </w:rPr>
+        <w:t>contenues dans le document ci-dessus : {question}</w:t>
+      </w:r>
+    </w:p>
+    <w:p>
+      <w:pPr>
+        <w:shd w:val="clear" w:color="auto" w:fill="EDF1F8"/>
+        <w:spacing w:after="40" w:line="264" w:lineRule="auto"/>
+        <w:ind w:left="200" w:right="200"/>
+        <w:rPr>
+          <w:sz w:val="24"/>
+          <w:szCs w:val="24"/>
+        </w:rPr>
+      </w:pPr>
+    </w:p>
+    <w:p>
+      <w:pPr>
+        <w:shd w:val="clear" w:color="auto" w:fill="EDF1F8"/>
+        <w:spacing w:after="40" w:line="264" w:lineRule="auto"/>
+        <w:ind w:left="200" w:right="200"/>
+        <w:rPr>
+          <w:sz w:val="24"/>
+          <w:szCs w:val="24"/>
+        </w:rPr>
+      </w:pPr>
+      <w:r>
+        <w:rPr>
+          <w:rFonts w:ascii="Consolas" w:eastAsia="Consolas" w:hAnsi="Consolas" w:cs="Consolas"/>
+          <w:sz w:val="24"/>
+          <w:szCs w:val="24"/>
+        </w:rPr>
+        <w:t>Contraintes :</w:t>
+      </w:r>
+    </w:p>
+    <w:p>
+      <w:pPr>
+        <w:shd w:val="clear" w:color="auto" w:fill="EDF1F8"/>
+        <w:spacing w:after="40" w:line="264" w:lineRule="auto"/>
+        <w:ind w:left="200" w:right="200"/>
+        <w:rPr>
+          <w:sz w:val="24"/>
+          <w:szCs w:val="24"/>
+        </w:rPr>
+      </w:pPr>
+      <w:r>
+        <w:rPr>
+          <w:rFonts w:ascii="Consolas" w:eastAsia="Consolas" w:hAnsi="Consolas" w:cs="Consolas"/>
+          <w:sz w:val="24"/>
+          <w:szCs w:val="24"/>
+        </w:rPr>
+        <w:t>- N'utilise aucune connaissance extérieure au document.</w:t>
+      </w:r>
+    </w:p>
+    <w:p>
+      <w:pPr>
+        <w:shd w:val="clear" w:color="auto" w:fill="EDF1F8"/>
+        <w:spacing w:after="40" w:line="264" w:lineRule="auto"/>
+        <w:ind w:left="200" w:right="200"/>
+        <w:rPr>
+          <w:sz w:val="24"/>
+          <w:szCs w:val="24"/>
+        </w:rPr>
+      </w:pPr>
+      <w:r>
+        <w:rPr>
+          <w:rFonts w:ascii="Consolas" w:eastAsia="Consolas" w:hAnsi="Consolas" w:cs="Consolas"/>
+          <w:sz w:val="24"/>
+          <w:szCs w:val="24"/>
+        </w:rPr>
+        <w:t>- Si l'information demandée n'est pas présente dans le document, réponds</w:t>
+      </w:r>
+      <w:r>
+        <w:rPr>
+          <w:sz w:val="24"/>
+          <w:szCs w:val="24"/>
+        </w:rPr>
+        <w:t xml:space="preserve"> </w:t>
+      </w:r>
+      <w:r>
+        <w:rPr>
+          <w:rFonts w:ascii="Consolas" w:eastAsia="Consolas" w:hAnsi="Consolas" w:cs="Consolas"/>
+          <w:sz w:val="24"/>
+          <w:szCs w:val="24"/>
+        </w:rPr>
+        <w:t>explicitement "Cette information n'est pas présente dans le document"</w:t>
+      </w:r>
+      <w:r>
+        <w:rPr>
+          <w:sz w:val="24"/>
+          <w:szCs w:val="24"/>
+        </w:rPr>
+        <w:t xml:space="preserve"> </w:t>
+      </w:r>
+      <w:r>
+        <w:rPr>
+          <w:rFonts w:ascii="Consolas" w:eastAsia="Consolas" w:hAnsi="Consolas" w:cs="Consolas"/>
+          <w:sz w:val="24"/>
+          <w:szCs w:val="24"/>
+        </w:rPr>
+        <w:t>plutôt que de deviner.</w:t>
+      </w:r>
+    </w:p>
+    <w:p>
+      <w:pPr>
+        <w:shd w:val="clear" w:color="auto" w:fill="EDF1F8"/>
+        <w:spacing w:after="40" w:line="264" w:lineRule="auto"/>
+        <w:ind w:left="200" w:right="200"/>
+        <w:rPr>
+          <w:sz w:val="24"/>
+          <w:szCs w:val="24"/>
+        </w:rPr>
+      </w:pPr>
+      <w:r>
+        <w:rPr>
+          <w:rFonts w:ascii="Consolas" w:eastAsia="Consolas" w:hAnsi="Consolas" w:cs="Consolas"/>
+          <w:sz w:val="24"/>
+          <w:szCs w:val="24"/>
+        </w:rPr>
+        <w:t>- Cite le passage exact (ou reformule brièvement) sur lequel tu t'appuies</w:t>
+      </w:r>
+      <w:r>
+        <w:rPr>
+          <w:sz w:val="24"/>
+          <w:szCs w:val="24"/>
+        </w:rPr>
+        <w:t xml:space="preserve"> </w:t>
+      </w:r>
+      <w:r>
+        <w:rPr>
+          <w:rFonts w:ascii="Consolas" w:eastAsia="Consolas" w:hAnsi="Consolas" w:cs="Consolas"/>
+          <w:sz w:val="24"/>
+          <w:szCs w:val="24"/>
+        </w:rPr>
+        <w:t>pour justifier ta réponse.</w:t>
+      </w:r>
+    </w:p>
+    <w:p/>
+    <w:p/>
+    <w:p>
+      <w:r>
+        <w:lastRenderedPageBreak/>
+        <w:drawing>
+          <wp:inline distT="0" distB="0" distL="0" distR="0" wp14:anchorId="27CDF2A3" wp14:editId="192A39B5">
+            <wp:extent cx="5760720" cy="2177415"/>
+            <wp:effectExtent l="0" t="0" r="0" b="0"/>
+            <wp:docPr id="1125582721" name="Image 1"/>
+            <wp:cNvGraphicFramePr>
+              <a:graphicFrameLocks xmlns:a="http://schemas.openxmlformats.org/drawingml/2006/main" noChangeAspect="1"/>
+            </wp:cNvGraphicFramePr>
+            <a:graphic xmlns:a="http://schemas.openxmlformats.org/drawingml/2006/main">
+              <a:graphicData uri="http://schemas.openxmlformats.org/drawingml/2006/picture">
+                <pic:pic xmlns:pic="http://schemas.openxmlformats.org/drawingml/2006/picture">
+                  <pic:nvPicPr>
+                    <pic:cNvPr id="1125582721" name=""/>
+                    <pic:cNvPicPr/>
+                  </pic:nvPicPr>
+                  <pic:blipFill>
+                    <a:blip r:embed="rId33"/>
+                    <a:stretch>
+                      <a:fillRect/>
+                    </a:stretch>
+                  </pic:blipFill>
+                  <pic:spPr>
+                    <a:xfrm>
+                      <a:off x="0" y="0"/>
+                      <a:ext cx="5760720" cy="2177415"/>
+                    </a:xfrm>
+                    <a:prstGeom prst="rect">
+                      <a:avLst/>
+                    </a:prstGeom>
+                  </pic:spPr>
+                </pic:pic>
+              </a:graphicData>
+            </a:graphic>
+          </wp:inline>
+        </w:drawing>
+      </w:r>
+    </w:p>
+    <w:p/>
+    <w:p/>
+    <w:p>
+      <w:pPr>
+        <w:pStyle w:val="Titre2"/>
+      </w:pPr>
+      <w:r>
+        <w:t>Comparaison des résultats</w:t>
+      </w:r>
+    </w:p>
+    <w:tbl>
+      <w:tblPr>
+        <w:tblW w:w="9026" w:type="dxa"/>
+        <w:tblBorders>
+          <w:top w:val="single" w:sz="4" w:space="0" w:color="auto"/>
+          <w:left w:val="single" w:sz="4" w:space="0" w:color="auto"/>
+          <w:bottom w:val="single" w:sz="4" w:space="0" w:color="auto"/>
+          <w:right w:val="single" w:sz="4" w:space="0" w:color="auto"/>
+          <w:insideH w:val="single" w:sz="4" w:space="0" w:color="auto"/>
+          <w:insideV w:val="single" w:sz="4" w:space="0" w:color="auto"/>
+        </w:tblBorders>
+        <w:tblCellMar>
+          <w:left w:w="10" w:type="dxa"/>
+          <w:right w:w="10" w:type="dxa"/>
+        </w:tblCellMar>
+        <w:tblLook w:val="04A0" w:firstRow="1" w:lastRow="0" w:firstColumn="1" w:lastColumn="0" w:noHBand="0" w:noVBand="1"/>
+      </w:tblPr>
+      <w:tblGrid>
+        <w:gridCol w:w="2100"/>
+        <w:gridCol w:w="2300"/>
+        <w:gridCol w:w="2313"/>
+        <w:gridCol w:w="2313"/>
+      </w:tblGrid>
+      <w:tr>
+        <w:tblPrEx>
+          <w:tblCellMar>
+            <w:top w:w="0" w:type="dxa"/>
+            <w:bottom w:w="0" w:type="dxa"/>
+          </w:tblCellMar>
+        </w:tblPrEx>
+        <w:tc>
+          <w:tcPr>
+            <w:tcW w:w="2100" w:type="dxa"/>
+            <w:shd w:val="clear" w:color="auto" w:fill="2E5090"/>
+            <w:tcMar>
+              <w:top w:w="80" w:type="dxa"/>
+              <w:left w:w="100" w:type="dxa"/>
+              <w:bottom w:w="80" w:type="dxa"/>
+              <w:right w:w="100" w:type="dxa"/>
+            </w:tcMar>
+          </w:tcPr>
+          <w:p>
+            <w:r>
+              <w:rPr>
+                <w:b/>
+                <w:bCs/>
+                <w:color w:val="FFFFFF"/>
+                <w:sz w:val="20"/>
+                <w:szCs w:val="20"/>
+              </w:rPr>
+              <w:t>Critère</w:t>
+            </w:r>
+          </w:p>
+        </w:tc>
+        <w:tc>
+          <w:tcPr>
+            <w:tcW w:w="2300" w:type="dxa"/>
+            <w:shd w:val="clear" w:color="auto" w:fill="2E5090"/>
+            <w:tcMar>
+              <w:top w:w="80" w:type="dxa"/>
+              <w:left w:w="100" w:type="dxa"/>
+              <w:bottom w:w="80" w:type="dxa"/>
+              <w:right w:w="100" w:type="dxa"/>
+            </w:tcMar>
+          </w:tcPr>
+          <w:p>
+            <w:r>
+              <w:rPr>
+                <w:b/>
+                <w:bCs/>
+                <w:color w:val="FFFFFF"/>
+                <w:sz w:val="20"/>
+                <w:szCs w:val="20"/>
+              </w:rPr>
+              <w:t>Prompt A (sans doc)</w:t>
+            </w:r>
+          </w:p>
+        </w:tc>
+        <w:tc>
+          <w:tcPr>
+            <w:tcW w:w="2313" w:type="dxa"/>
+            <w:shd w:val="clear" w:color="auto" w:fill="2E5090"/>
+            <w:tcMar>
+              <w:top w:w="80" w:type="dxa"/>
+              <w:left w:w="100" w:type="dxa"/>
+              <w:bottom w:w="80" w:type="dxa"/>
+              <w:right w:w="100" w:type="dxa"/>
+            </w:tcMar>
+          </w:tcPr>
+          <w:p>
+            <w:r>
+              <w:rPr>
+                <w:b/>
+                <w:bCs/>
+                <w:color w:val="FFFFFF"/>
+                <w:sz w:val="20"/>
+                <w:szCs w:val="20"/>
+              </w:rPr>
+              <w:t>Prompt B (avec doc)</w:t>
+            </w:r>
+          </w:p>
+        </w:tc>
+        <w:tc>
+          <w:tcPr>
+            <w:tcW w:w="2313" w:type="dxa"/>
+            <w:shd w:val="clear" w:color="auto" w:fill="2E5090"/>
+            <w:tcMar>
+              <w:top w:w="80" w:type="dxa"/>
+              <w:left w:w="100" w:type="dxa"/>
+              <w:bottom w:w="80" w:type="dxa"/>
+              <w:right w:w="100" w:type="dxa"/>
+            </w:tcMar>
+          </w:tcPr>
+          <w:p>
+            <w:r>
+              <w:rPr>
+                <w:b/>
+                <w:bCs/>
+                <w:color w:val="FFFFFF"/>
+                <w:sz w:val="20"/>
+                <w:szCs w:val="20"/>
+              </w:rPr>
+              <w:t>Prompt C (doc + contraintes)</w:t>
+            </w:r>
+          </w:p>
+        </w:tc>
+      </w:tr>
+      <w:tr>
+        <w:tblPrEx>
+          <w:tblCellMar>
+            <w:top w:w="0" w:type="dxa"/>
+            <w:bottom w:w="0" w:type="dxa"/>
+          </w:tblCellMar>
+        </w:tblPrEx>
+        <w:tc>
+          <w:tcPr>
+            <w:tcW w:w="2100" w:type="dxa"/>
+            <w:tcMar>
+              <w:top w:w="80" w:type="dxa"/>
+              <w:left w:w="100" w:type="dxa"/>
+              <w:bottom w:w="80" w:type="dxa"/>
+              <w:right w:w="100" w:type="dxa"/>
+            </w:tcMar>
+          </w:tcPr>
+          <w:p>
+            <w:r>
+              <w:rPr>
+                <w:sz w:val="20"/>
+                <w:szCs w:val="20"/>
+              </w:rPr>
+              <w:t>Ancrage dans la source</w:t>
+            </w:r>
+          </w:p>
+        </w:tc>
+        <w:tc>
+          <w:tcPr>
+            <w:tcW w:w="2300" w:type="dxa"/>
+            <w:tcMar>
+              <w:top w:w="80" w:type="dxa"/>
+              <w:left w:w="100" w:type="dxa"/>
+              <w:bottom w:w="80" w:type="dxa"/>
+              <w:right w:w="100" w:type="dxa"/>
+            </w:tcMar>
+          </w:tcPr>
+          <w:p>
+            <w:r>
+              <w:rPr>
+                <w:sz w:val="20"/>
+                <w:szCs w:val="20"/>
+              </w:rPr>
+              <w:t>Aucun</w:t>
+            </w:r>
+          </w:p>
+        </w:tc>
+        <w:tc>
+          <w:tcPr>
+            <w:tcW w:w="2313" w:type="dxa"/>
+            <w:tcMar>
+              <w:top w:w="80" w:type="dxa"/>
+              <w:left w:w="100" w:type="dxa"/>
+              <w:bottom w:w="80" w:type="dxa"/>
+              <w:right w:w="100" w:type="dxa"/>
+            </w:tcMar>
+          </w:tcPr>
+          <w:p>
+            <w:r>
+              <w:rPr>
+                <w:sz w:val="20"/>
+                <w:szCs w:val="20"/>
+              </w:rPr>
+              <w:t>Partiel</w:t>
+            </w:r>
+          </w:p>
+        </w:tc>
+        <w:tc>
+          <w:tcPr>
+            <w:tcW w:w="2313" w:type="dxa"/>
+            <w:tcMar>
+              <w:top w:w="80" w:type="dxa"/>
+              <w:left w:w="100" w:type="dxa"/>
+              <w:bottom w:w="80" w:type="dxa"/>
+              <w:right w:w="100" w:type="dxa"/>
+            </w:tcMar>
+          </w:tcPr>
+          <w:p>
+            <w:r>
+              <w:rPr>
+                <w:sz w:val="20"/>
+                <w:szCs w:val="20"/>
+              </w:rPr>
+              <w:t>Fort, avec citation</w:t>
+            </w:r>
+          </w:p>
+        </w:tc>
+      </w:tr>
+      <w:tr>
+        <w:tblPrEx>
+          <w:tblCellMar>
+            <w:top w:w="0" w:type="dxa"/>
+            <w:bottom w:w="0" w:type="dxa"/>
+          </w:tblCellMar>
+        </w:tblPrEx>
+        <w:tc>
+          <w:tcPr>
+            <w:tcW w:w="2100" w:type="dxa"/>
+            <w:tcMar>
+              <w:top w:w="80" w:type="dxa"/>
+              <w:left w:w="100" w:type="dxa"/>
+              <w:bottom w:w="80" w:type="dxa"/>
+              <w:right w:w="100" w:type="dxa"/>
+            </w:tcMar>
+          </w:tcPr>
+          <w:p>
+            <w:r>
+              <w:rPr>
+                <w:sz w:val="20"/>
+                <w:szCs w:val="20"/>
+              </w:rPr>
+              <w:t>Risque d'hallucination</w:t>
+            </w:r>
+          </w:p>
+        </w:tc>
+        <w:tc>
+          <w:tcPr>
+            <w:tcW w:w="2300" w:type="dxa"/>
+            <w:tcMar>
+              <w:top w:w="80" w:type="dxa"/>
+              <w:left w:w="100" w:type="dxa"/>
+              <w:bottom w:w="80" w:type="dxa"/>
+              <w:right w:w="100" w:type="dxa"/>
+            </w:tcMar>
+          </w:tcPr>
+          <w:p>
+            <w:r>
+              <w:rPr>
+                <w:sz w:val="20"/>
+                <w:szCs w:val="20"/>
+              </w:rPr>
+              <w:t>Élevé</w:t>
+            </w:r>
+          </w:p>
+        </w:tc>
+        <w:tc>
+          <w:tcPr>
+            <w:tcW w:w="2313" w:type="dxa"/>
+            <w:tcMar>
+              <w:top w:w="80" w:type="dxa"/>
+              <w:left w:w="100" w:type="dxa"/>
+              <w:bottom w:w="80" w:type="dxa"/>
+              <w:right w:w="100" w:type="dxa"/>
+            </w:tcMar>
+          </w:tcPr>
+          <w:p>
+            <w:r>
+              <w:rPr>
+                <w:sz w:val="20"/>
+                <w:szCs w:val="20"/>
+              </w:rPr>
+              <w:t>Modéré</w:t>
+            </w:r>
+          </w:p>
+        </w:tc>
+        <w:tc>
+          <w:tcPr>
+            <w:tcW w:w="2313" w:type="dxa"/>
+            <w:tcMar>
+              <w:top w:w="80" w:type="dxa"/>
+              <w:left w:w="100" w:type="dxa"/>
+              <w:bottom w:w="80" w:type="dxa"/>
+              <w:right w:w="100" w:type="dxa"/>
+            </w:tcMar>
+          </w:tcPr>
+          <w:p>
+            <w:r>
+              <w:rPr>
+                <w:sz w:val="20"/>
+                <w:szCs w:val="20"/>
+              </w:rPr>
+              <w:t>Faible</w:t>
+            </w:r>
+          </w:p>
+        </w:tc>
+      </w:tr>
+      <w:tr>
+        <w:tblPrEx>
+          <w:tblCellMar>
+            <w:top w:w="0" w:type="dxa"/>
+            <w:bottom w:w="0" w:type="dxa"/>
+          </w:tblCellMar>
+        </w:tblPrEx>
+        <w:tc>
+          <w:tcPr>
+            <w:tcW w:w="2100" w:type="dxa"/>
+            <w:tcMar>
+              <w:top w:w="80" w:type="dxa"/>
+              <w:left w:w="100" w:type="dxa"/>
+              <w:bottom w:w="80" w:type="dxa"/>
+              <w:right w:w="100" w:type="dxa"/>
+            </w:tcMar>
+          </w:tcPr>
+          <w:p>
+            <w:r>
+              <w:rPr>
+                <w:sz w:val="20"/>
+                <w:szCs w:val="20"/>
+              </w:rPr>
+              <w:t>Gestion de l'info absente</w:t>
+            </w:r>
+          </w:p>
+        </w:tc>
+        <w:tc>
+          <w:tcPr>
+            <w:tcW w:w="2300" w:type="dxa"/>
+            <w:tcMar>
+              <w:top w:w="80" w:type="dxa"/>
+              <w:left w:w="100" w:type="dxa"/>
+              <w:bottom w:w="80" w:type="dxa"/>
+              <w:right w:w="100" w:type="dxa"/>
+            </w:tcMar>
+          </w:tcPr>
+          <w:p>
+            <w:r>
+              <w:rPr>
+                <w:sz w:val="20"/>
+                <w:szCs w:val="20"/>
+              </w:rPr>
+              <w:t>Non détectée (</w:t>
+            </w:r>
+            <w:r>
+              <w:rPr>
+                <w:sz w:val="20"/>
+                <w:szCs w:val="20"/>
+              </w:rPr>
+              <w:t>Pas de réponse</w:t>
+            </w:r>
+            <w:r>
+              <w:rPr>
+                <w:sz w:val="20"/>
+                <w:szCs w:val="20"/>
+              </w:rPr>
+              <w:t>)</w:t>
+            </w:r>
+          </w:p>
+        </w:tc>
+        <w:tc>
+          <w:tcPr>
+            <w:tcW w:w="2313" w:type="dxa"/>
+            <w:tcMar>
+              <w:top w:w="80" w:type="dxa"/>
+              <w:left w:w="100" w:type="dxa"/>
+              <w:bottom w:w="80" w:type="dxa"/>
+              <w:right w:w="100" w:type="dxa"/>
+            </w:tcMar>
+          </w:tcPr>
+          <w:p>
+            <w:r>
+              <w:rPr>
+                <w:sz w:val="20"/>
+                <w:szCs w:val="20"/>
+              </w:rPr>
+              <w:t>Rarement signalée</w:t>
+            </w:r>
+          </w:p>
+        </w:tc>
+        <w:tc>
+          <w:tcPr>
+            <w:tcW w:w="2313" w:type="dxa"/>
+            <w:tcMar>
+              <w:top w:w="80" w:type="dxa"/>
+              <w:left w:w="100" w:type="dxa"/>
+              <w:bottom w:w="80" w:type="dxa"/>
+              <w:right w:w="100" w:type="dxa"/>
+            </w:tcMar>
+          </w:tcPr>
+          <w:p>
+            <w:r>
+              <w:rPr>
+                <w:sz w:val="20"/>
+                <w:szCs w:val="20"/>
+              </w:rPr>
+              <w:t>Explicitement signalée</w:t>
+            </w:r>
+          </w:p>
+        </w:tc>
+      </w:tr>
+      <w:tr>
+        <w:tblPrEx>
+          <w:tblCellMar>
+            <w:top w:w="0" w:type="dxa"/>
+            <w:bottom w:w="0" w:type="dxa"/>
+          </w:tblCellMar>
+        </w:tblPrEx>
+        <w:tc>
+          <w:tcPr>
+            <w:tcW w:w="2100" w:type="dxa"/>
+            <w:tcMar>
+              <w:top w:w="80" w:type="dxa"/>
+              <w:left w:w="100" w:type="dxa"/>
+              <w:bottom w:w="80" w:type="dxa"/>
+              <w:right w:w="100" w:type="dxa"/>
+            </w:tcMar>
+          </w:tcPr>
+          <w:p>
+            <w:r>
+              <w:rPr>
+                <w:sz w:val="20"/>
+                <w:szCs w:val="20"/>
+              </w:rPr>
+              <w:t>Traçabilité de la réponse</w:t>
+            </w:r>
+          </w:p>
+        </w:tc>
+        <w:tc>
+          <w:tcPr>
+            <w:tcW w:w="2300" w:type="dxa"/>
+            <w:tcMar>
+              <w:top w:w="80" w:type="dxa"/>
+              <w:left w:w="100" w:type="dxa"/>
+              <w:bottom w:w="80" w:type="dxa"/>
+              <w:right w:w="100" w:type="dxa"/>
+            </w:tcMar>
+          </w:tcPr>
+          <w:p>
+            <w:r>
+              <w:rPr>
+                <w:sz w:val="20"/>
+                <w:szCs w:val="20"/>
+              </w:rPr>
+              <w:t>Aucune</w:t>
+            </w:r>
+          </w:p>
+        </w:tc>
+        <w:tc>
+          <w:tcPr>
+            <w:tcW w:w="2313" w:type="dxa"/>
+            <w:tcMar>
+              <w:top w:w="80" w:type="dxa"/>
+              <w:left w:w="100" w:type="dxa"/>
+              <w:bottom w:w="80" w:type="dxa"/>
+              <w:right w:w="100" w:type="dxa"/>
+            </w:tcMar>
+          </w:tcPr>
+          <w:p>
+            <w:r>
+              <w:rPr>
+                <w:sz w:val="20"/>
+                <w:szCs w:val="20"/>
+              </w:rPr>
+              <w:t>Faible</w:t>
+            </w:r>
+          </w:p>
+        </w:tc>
+        <w:tc>
+          <w:tcPr>
+            <w:tcW w:w="2313" w:type="dxa"/>
+            <w:tcMar>
+              <w:top w:w="80" w:type="dxa"/>
+              <w:left w:w="100" w:type="dxa"/>
+              <w:bottom w:w="80" w:type="dxa"/>
+              <w:right w:w="100" w:type="dxa"/>
+            </w:tcMar>
+          </w:tcPr>
+          <w:p>
+            <w:r>
+              <w:rPr>
+                <w:sz w:val="20"/>
+                <w:szCs w:val="20"/>
+              </w:rPr>
+              <w:t>Passage/source cité</w:t>
+            </w:r>
+          </w:p>
+        </w:tc>
+      </w:tr>
+      <w:tr>
+        <w:tblPrEx>
+          <w:tblCellMar>
+            <w:top w:w="0" w:type="dxa"/>
+            <w:bottom w:w="0" w:type="dxa"/>
+          </w:tblCellMar>
+        </w:tblPrEx>
+        <w:tc>
+          <w:tcPr>
+            <w:tcW w:w="2100" w:type="dxa"/>
+            <w:tcMar>
+              <w:top w:w="80" w:type="dxa"/>
+              <w:left w:w="100" w:type="dxa"/>
+              <w:bottom w:w="80" w:type="dxa"/>
+              <w:right w:w="100" w:type="dxa"/>
+            </w:tcMar>
+          </w:tcPr>
+          <w:p>
+            <w:r>
+              <w:rPr>
+                <w:sz w:val="20"/>
+                <w:szCs w:val="20"/>
+              </w:rPr>
+              <w:t>Cas d'usage recommandé</w:t>
+            </w:r>
+          </w:p>
+        </w:tc>
+        <w:tc>
+          <w:tcPr>
+            <w:tcW w:w="2300" w:type="dxa"/>
+            <w:tcMar>
+              <w:top w:w="80" w:type="dxa"/>
+              <w:left w:w="100" w:type="dxa"/>
+              <w:bottom w:w="80" w:type="dxa"/>
+              <w:right w:w="100" w:type="dxa"/>
+            </w:tcMar>
+          </w:tcPr>
+          <w:p>
+            <w:r>
+              <w:rPr>
+                <w:sz w:val="20"/>
+                <w:szCs w:val="20"/>
+              </w:rPr>
+              <w:t>Culture générale uniquement</w:t>
+            </w:r>
+          </w:p>
+        </w:tc>
+        <w:tc>
+          <w:tcPr>
+            <w:tcW w:w="2313" w:type="dxa"/>
+            <w:tcMar>
+              <w:top w:w="80" w:type="dxa"/>
+              <w:left w:w="100" w:type="dxa"/>
+              <w:bottom w:w="80" w:type="dxa"/>
+              <w:right w:w="100" w:type="dxa"/>
+            </w:tcMar>
+          </w:tcPr>
+          <w:p>
+            <w:r>
+              <w:rPr>
+                <w:sz w:val="20"/>
+                <w:szCs w:val="20"/>
+              </w:rPr>
+              <w:t>Prototypage rapide</w:t>
+            </w:r>
+          </w:p>
+        </w:tc>
+        <w:tc>
+          <w:tcPr>
+            <w:tcW w:w="2313" w:type="dxa"/>
+            <w:tcMar>
+              <w:top w:w="80" w:type="dxa"/>
+              <w:left w:w="100" w:type="dxa"/>
+              <w:bottom w:w="80" w:type="dxa"/>
+              <w:right w:w="100" w:type="dxa"/>
+            </w:tcMar>
+          </w:tcPr>
+          <w:p>
+            <w:r>
+              <w:rPr>
+                <w:sz w:val="20"/>
+                <w:szCs w:val="20"/>
+              </w:rPr>
+              <w:t>Application métier fiable (RAG production)</w:t>
+            </w:r>
+          </w:p>
+        </w:tc>
+      </w:tr>
+    </w:tbl>
+    <w:p/>
     <w:sectPr>
       <w:pgSz w:w="11906" w:h="16838"/>
       <w:pgMar w:top="1417" w:right="1417" w:bottom="1417" w:left="1417" w:header="708" w:footer="708" w:gutter="0"/>
@@ -19710,6 +21052,95 @@
     </w:lvl>
   </w:abstractNum>
   <w:abstractNum w:abstractNumId="2" w15:restartNumberingAfterBreak="0">
+    <w:nsid w:val="6B560ADA"/>
+    <w:multiLevelType w:val="hybridMultilevel"/>
+    <w:tmpl w:val="ED88130A"/>
+    <w:lvl w:ilvl="0" w:tplc="FFFFFFFF">
+      <w:start w:val="1"/>
+      <w:numFmt w:val="decimal"/>
+      <w:lvlText w:val="%1)"/>
+      <w:lvlJc w:val="left"/>
+      <w:pPr>
+        <w:ind w:left="1068" w:hanging="360"/>
+      </w:pPr>
+      <w:rPr>
+        <w:rFonts w:hint="default"/>
+      </w:rPr>
+    </w:lvl>
+    <w:lvl w:ilvl="1" w:tplc="FFFFFFFF" w:tentative="1">
+      <w:start w:val="1"/>
+      <w:numFmt w:val="lowerLetter"/>
+      <w:lvlText w:val="%2."/>
+      <w:lvlJc w:val="left"/>
+      <w:pPr>
+        <w:ind w:left="1788" w:hanging="360"/>
+      </w:pPr>
+    </w:lvl>
+    <w:lvl w:ilvl="2" w:tplc="FFFFFFFF" w:tentative="1">
+      <w:start w:val="1"/>
+      <w:numFmt w:val="lowerRoman"/>
+      <w:lvlText w:val="%3."/>
+      <w:lvlJc w:val="right"/>
+      <w:pPr>
+        <w:ind w:left="2508" w:hanging="180"/>
+      </w:pPr>
+    </w:lvl>
+    <w:lvl w:ilvl="3" w:tplc="FFFFFFFF" w:tentative="1">
+      <w:start w:val="1"/>
+      <w:numFmt w:val="decimal"/>
+      <w:lvlText w:val="%4."/>
+      <w:lvlJc w:val="left"/>
+      <w:pPr>
+        <w:ind w:left="3228" w:hanging="360"/>
+      </w:pPr>
+    </w:lvl>
+    <w:lvl w:ilvl="4" w:tplc="FFFFFFFF" w:tentative="1">
+      <w:start w:val="1"/>
+      <w:numFmt w:val="lowerLetter"/>
+      <w:lvlText w:val="%5."/>
+      <w:lvlJc w:val="left"/>
+      <w:pPr>
+        <w:ind w:left="3948" w:hanging="360"/>
+      </w:pPr>
+    </w:lvl>
+    <w:lvl w:ilvl="5" w:tplc="FFFFFFFF" w:tentative="1">
+      <w:start w:val="1"/>
+      <w:numFmt w:val="lowerRoman"/>
+      <w:lvlText w:val="%6."/>
+      <w:lvlJc w:val="right"/>
+      <w:pPr>
+        <w:ind w:left="4668" w:hanging="180"/>
+      </w:pPr>
+    </w:lvl>
+    <w:lvl w:ilvl="6" w:tplc="FFFFFFFF" w:tentative="1">
+      <w:start w:val="1"/>
+      <w:numFmt w:val="decimal"/>
+      <w:lvlText w:val="%7."/>
+      <w:lvlJc w:val="left"/>
+      <w:pPr>
+        <w:ind w:left="5388" w:hanging="360"/>
+      </w:pPr>
+    </w:lvl>
+    <w:lvl w:ilvl="7" w:tplc="FFFFFFFF" w:tentative="1">
+      <w:start w:val="1"/>
+      <w:numFmt w:val="lowerLetter"/>
+      <w:lvlText w:val="%8."/>
+      <w:lvlJc w:val="left"/>
+      <w:pPr>
+        <w:ind w:left="6108" w:hanging="360"/>
+      </w:pPr>
+    </w:lvl>
+    <w:lvl w:ilvl="8" w:tplc="FFFFFFFF" w:tentative="1">
+      <w:start w:val="1"/>
+      <w:numFmt w:val="lowerRoman"/>
+      <w:lvlText w:val="%9."/>
+      <w:lvlJc w:val="right"/>
+      <w:pPr>
+        <w:ind w:left="6828" w:hanging="180"/>
+      </w:pPr>
+    </w:lvl>
+  </w:abstractNum>
+  <w:abstractNum w:abstractNumId="3" w15:restartNumberingAfterBreak="0">
     <w:nsid w:val="7CBA4C47"/>
     <w:multiLevelType w:val="hybridMultilevel"/>
     <w:tmpl w:val="261680E6"/>
@@ -19767,13 +21198,16 @@
     <w:abstractNumId w:val="0"/>
   </w:num>
   <w:num w:numId="2" w16cid:durableId="1040784090">
-    <w:abstractNumId w:val="2"/>
+    <w:abstractNumId w:val="3"/>
     <w:lvlOverride w:ilvl="0">
       <w:startOverride w:val="1"/>
     </w:lvlOverride>
   </w:num>
   <w:num w:numId="3" w16cid:durableId="735712189">
     <w:abstractNumId w:val="1"/>
+  </w:num>
+  <w:num w:numId="4" w16cid:durableId="2074544279">
+    <w:abstractNumId w:val="2"/>
   </w:num>
 </w:numbering>
 </file>

</xml_diff>